<commit_message>
docs: mise a jour contrat OGE - 10 ans, penalite 500k+12%, texte noir, couleurs marque
</commit_message>
<xml_diff>
--- a/.skills/ChefsOge/proposition_commerciale_oge.docx
+++ b/.skills/ChefsOge/proposition_commerciale_oge.docx
@@ -3,17 +3,39 @@
 <w:document xmlns:wpc="http://schemas.microsoft.com/office/word/2010/wordprocessingCanvas" xmlns:mo="http://schemas.microsoft.com/office/mac/office/2008/main" xmlns:mc="http://schemas.openxmlformats.org/markup-compatibility/2006" xmlns:mv="urn:schemas-microsoft-com:mac:vml" xmlns:o="urn:schemas-microsoft-com:office:office" xmlns:r="http://schemas.openxmlformats.org/officeDocument/2006/relationships" xmlns:m="http://schemas.openxmlformats.org/officeDocument/2006/math" xmlns:v="urn:schemas-microsoft-com:vml" xmlns:wp14="http://schemas.microsoft.com/office/word/2010/wordprocessingDrawing" xmlns:wp="http://schemas.openxmlformats.org/drawingml/2006/wordprocessingDrawing" xmlns:w10="urn:schemas-microsoft-com:office:word" xmlns:w="http://schemas.openxmlformats.org/wordprocessingml/2006/main" xmlns:w14="http://schemas.microsoft.com/office/word/2010/wordml" xmlns:wpg="http://schemas.microsoft.com/office/word/2010/wordprocessingGroup" xmlns:wpi="http://schemas.microsoft.com/office/word/2010/wordprocessingInk" xmlns:wne="http://schemas.microsoft.com/office/word/2006/wordml" xmlns:wps="http://schemas.microsoft.com/office/word/2010/wordprocessingShape" mc:Ignorable="w14 wp14">
   <w:body>
     <w:p>
-      <w:r/>
+      <w:pPr>
+        <w:pStyle w:val="Heading1"/>
+        <w:keepNext/>
+        <w:spacing w:before="240" w:after="120"/>
+      </w:pPr>
       <w:r>
         <w:rPr>
+          <w:rFonts w:ascii="Calibri Light" w:hAnsi="Calibri Light"/>
           <w:b/>
+          <w:color w:val="000000"/>
+          <w:sz w:val="40"/>
+        </w:rPr>
+        <w:t>OGE ACADÉMIE — PARTENARIAT TECHNIQUE &amp; COMMERCIAL</w:t>
+      </w:r>
+    </w:p>
+    <w:p>
+      <w:r/>
+    </w:p>
+    <w:p>
+      <w:pPr>
+        <w:pStyle w:val="Heading1"/>
+        <w:keepNext/>
+        <w:spacing w:before="240" w:after="120"/>
+      </w:pPr>
+      <w:r>
+        <w:rPr>
+          <w:rFonts w:ascii="Calibri Light" w:hAnsi="Calibri Light"/>
+          <w:b/>
+          <w:color w:val="000000"/>
+          <w:sz w:val="40"/>
         </w:rPr>
         <w:t>PROPOSITION COMMERCIALE &amp; CONTRAT DE PARTENARIAT</w:t>
       </w:r>
-      <w:r/>
-    </w:p>
-    <w:p>
-      <w:r/>
     </w:p>
     <w:p>
       <w:r>
@@ -22,6 +44,11 @@
     </w:p>
     <w:p>
       <w:r/>
+    </w:p>
+    <w:p>
+      <w:r>
+        <w:t>---</w:t>
+      </w:r>
     </w:p>
     <w:p>
       <w:r/>
@@ -50,7 +77,7 @@
               <w:left w:w="180" w:type="dxa"/>
               <w:right w:w="180" w:type="dxa"/>
             </w:tcMar>
-            <w:shd w:fill="1A5276"/>
+            <w:shd w:fill="FF7900"/>
           </w:tcPr>
           <w:p>
             <w:pPr>
@@ -61,7 +88,7 @@
                 <w:b/>
                 <w:color w:val="FFFFFF"/>
               </w:rPr>
-              <w:t>Destinataires :</w:t>
+              <w:t>---</w:t>
             </w:r>
           </w:p>
         </w:tc>
@@ -74,7 +101,7 @@
               <w:left w:w="180" w:type="dxa"/>
               <w:right w:w="180" w:type="dxa"/>
             </w:tcMar>
-            <w:shd w:fill="1A5276"/>
+            <w:shd w:fill="FF7900"/>
           </w:tcPr>
           <w:p>
             <w:pPr>
@@ -85,7 +112,1050 @@
                 <w:b/>
                 <w:color w:val="FFFFFF"/>
               </w:rPr>
-              <w:t>Les Entrepreneurs Co-Fondateurs d'OGE Académie</w:t>
+              <w:t>---</w:t>
+            </w:r>
+          </w:p>
+        </w:tc>
+      </w:tr>
+      <w:tr>
+        <w:trPr>
+          <w:cantSplit/>
+        </w:trPr>
+        <w:tc>
+          <w:tcPr>
+            <w:tcW w:type="dxa" w:w="4680"/>
+            <w:tcMar>
+              <w:top w:w="140" w:type="dxa"/>
+              <w:bottom w:w="140" w:type="dxa"/>
+              <w:left w:w="180" w:type="dxa"/>
+              <w:right w:w="180" w:type="dxa"/>
+            </w:tcMar>
+          </w:tcPr>
+          <w:p>
+            <w:pPr>
+              <w:jc w:val="left"/>
+            </w:pPr>
+            <w:r/>
+            <w:r>
+              <w:rPr>
+                <w:b/>
+              </w:rPr>
+              <w:t>M. Sidoine K.</w:t>
+            </w:r>
+            <w:r>
+              <w:t xml:space="preserve"> (Concepteur)</w:t>
+            </w:r>
+          </w:p>
+        </w:tc>
+        <w:tc>
+          <w:tcPr>
+            <w:tcW w:type="dxa" w:w="4680"/>
+            <w:tcMar>
+              <w:top w:w="140" w:type="dxa"/>
+              <w:bottom w:w="140" w:type="dxa"/>
+              <w:left w:w="180" w:type="dxa"/>
+              <w:right w:w="180" w:type="dxa"/>
+            </w:tcMar>
+          </w:tcPr>
+          <w:p>
+            <w:pPr>
+              <w:jc w:val="left"/>
+            </w:pPr>
+            <w:r/>
+            <w:r>
+              <w:rPr>
+                <w:b/>
+              </w:rPr>
+              <w:t>OGE Académie</w:t>
+            </w:r>
+            <w:r>
+              <w:t xml:space="preserve"> (M. [Nom de l'Entrepreneur 1] &amp; M. [Nom de l'Entrepreneur 2])</w:t>
+            </w:r>
+          </w:p>
+        </w:tc>
+      </w:tr>
+      <w:tr>
+        <w:trPr>
+          <w:cantSplit/>
+        </w:trPr>
+        <w:tc>
+          <w:tcPr>
+            <w:tcW w:type="dxa" w:w="4680"/>
+            <w:tcMar>
+              <w:top w:w="140" w:type="dxa"/>
+              <w:bottom w:w="140" w:type="dxa"/>
+              <w:left w:w="180" w:type="dxa"/>
+              <w:right w:w="180" w:type="dxa"/>
+            </w:tcMar>
+            <w:shd w:fill="F2F4F4"/>
+          </w:tcPr>
+          <w:p>
+            <w:pPr>
+              <w:jc w:val="left"/>
+            </w:pPr>
+            <w:r>
+              <w:t>krsidoine7@gmail.com</w:t>
+            </w:r>
+          </w:p>
+        </w:tc>
+        <w:tc>
+          <w:tcPr>
+            <w:tcW w:type="dxa" w:w="4680"/>
+            <w:tcMar>
+              <w:top w:w="140" w:type="dxa"/>
+              <w:bottom w:w="140" w:type="dxa"/>
+              <w:left w:w="180" w:type="dxa"/>
+              <w:right w:w="180" w:type="dxa"/>
+            </w:tcMar>
+            <w:shd w:fill="F2F4F4"/>
+          </w:tcPr>
+          <w:p>
+            <w:pPr>
+              <w:jc w:val="left"/>
+            </w:pPr>
+            <w:r>
+              <w:t>Contacts : Administrateurs Généraux</w:t>
+            </w:r>
+          </w:p>
+        </w:tc>
+      </w:tr>
+      <w:tr>
+        <w:trPr>
+          <w:cantSplit/>
+        </w:trPr>
+        <w:tc>
+          <w:tcPr>
+            <w:tcW w:type="dxa" w:w="4680"/>
+            <w:tcMar>
+              <w:top w:w="140" w:type="dxa"/>
+              <w:bottom w:w="140" w:type="dxa"/>
+              <w:left w:w="180" w:type="dxa"/>
+              <w:right w:w="180" w:type="dxa"/>
+            </w:tcMar>
+          </w:tcPr>
+          <w:p>
+            <w:pPr>
+              <w:jc w:val="left"/>
+            </w:pPr>
+            <w:r>
+              <w:t>+225 0503681588</w:t>
+            </w:r>
+          </w:p>
+        </w:tc>
+        <w:tc>
+          <w:tcPr>
+            <w:tcW w:type="dxa" w:w="4680"/>
+            <w:tcMar>
+              <w:top w:w="140" w:type="dxa"/>
+              <w:bottom w:w="140" w:type="dxa"/>
+              <w:left w:w="180" w:type="dxa"/>
+              <w:right w:w="180" w:type="dxa"/>
+            </w:tcMar>
+          </w:tcPr>
+          <w:p>
+            <w:pPr>
+              <w:jc w:val="left"/>
+            </w:pPr>
+            <w:r/>
+            <w:r>
+              <w:rPr>
+                <w:b/>
+              </w:rPr>
+              <w:t>Durée d'engagement :</w:t>
+            </w:r>
+            <w:r>
+              <w:t xml:space="preserve"> 10 Ans Ferme</w:t>
+            </w:r>
+          </w:p>
+        </w:tc>
+      </w:tr>
+    </w:tbl>
+    <w:p>
+      <w:pPr>
+        <w:spacing w:before="120"/>
+      </w:pPr>
+    </w:p>
+    <w:p>
+      <w:r/>
+    </w:p>
+    <w:p>
+      <w:r>
+        <w:t>---</w:t>
+      </w:r>
+    </w:p>
+    <w:p>
+      <w:r/>
+    </w:p>
+    <w:p>
+      <w:pPr>
+        <w:pStyle w:val="Heading2"/>
+        <w:keepNext/>
+        <w:spacing w:before="240" w:after="120"/>
+      </w:pPr>
+      <w:r>
+        <w:rPr>
+          <w:rFonts w:ascii="Calibri Light" w:hAnsi="Calibri Light"/>
+          <w:b/>
+          <w:color w:val="000000"/>
+          <w:sz w:val="32"/>
+        </w:rPr>
+        <w:t>1. Présentation de la Solution OGE Académie</w:t>
+      </w:r>
+    </w:p>
+    <w:p>
+      <w:r/>
+    </w:p>
+    <w:p>
+      <w:r>
+        <w:t>OGE Académie est une solution numérique conçue pour des entrepreneurs proposant des services de préparation aux trois concours d'élite de Côte d'Ivoire : l'INP-HB, l'ESATIC et le CME. Portée par de jeunes diplômés issus de ces écoles qui en maîtrisent parfaitement les concours d’accès, la plateforme a été développée en collaboration avec des professeurs qualifiés pour aider les candidats à réussir.</w:t>
+      </w:r>
+    </w:p>
+    <w:p>
+      <w:r/>
+    </w:p>
+    <w:p>
+      <w:r>
+        <w:t>Cette solution digitale centralisée permet d'assurer :</w:t>
+      </w:r>
+    </w:p>
+    <w:p>
+      <w:pPr>
+        <w:pStyle w:val="ListBullet"/>
+      </w:pPr>
+      <w:r>
+        <w:t>L'inscription simplifiée des candidats en ligne (séparée par zone géographique et mode de préparation présentiel/en ligne).</w:t>
+      </w:r>
+    </w:p>
+    <w:p>
+      <w:pPr>
+        <w:pStyle w:val="ListBullet"/>
+      </w:pPr>
+      <w:r>
+        <w:t>La gestion transparente des offres de préparation et la validation des reçus de paiement locaux (via Wave).</w:t>
+      </w:r>
+    </w:p>
+    <w:p>
+      <w:pPr>
+        <w:pStyle w:val="ListBullet"/>
+      </w:pPr>
+      <w:r>
+        <w:t>La mise à disposition sécurisée des supports de cours PDF et des sessions de visioconférence Google Meet, tout en protégeant les droits d'auteur des professeurs (affichage sécurisé sans téléchargement ni copie non autorisée).</w:t>
+      </w:r>
+    </w:p>
+    <w:p>
+      <w:r/>
+    </w:p>
+    <w:p>
+      <w:r>
+        <w:t>---</w:t>
+      </w:r>
+    </w:p>
+    <w:p>
+      <w:r/>
+    </w:p>
+    <w:p>
+      <w:pPr>
+        <w:pStyle w:val="Heading2"/>
+        <w:keepNext/>
+        <w:spacing w:before="240" w:after="120"/>
+      </w:pPr>
+      <w:r>
+        <w:rPr>
+          <w:rFonts w:ascii="Calibri Light" w:hAnsi="Calibri Light"/>
+          <w:b/>
+          <w:color w:val="000000"/>
+          <w:sz w:val="32"/>
+        </w:rPr>
+        <w:t>2. Stratégie d'Hébergement et Optimisation des Coûts</w:t>
+      </w:r>
+    </w:p>
+    <w:p>
+      <w:r/>
+    </w:p>
+    <w:p>
+      <w:r>
+        <w:t>Afin de démarrer le projet de manière économe, l'architecture a été conçue pour maximiser l'usage des offres gratuites et optimiser le budget technique :</w:t>
+      </w:r>
+    </w:p>
+    <w:p>
+      <w:r/>
+    </w:p>
+    <w:p>
+      <w:pPr>
+        <w:pStyle w:val="ListBullet"/>
+      </w:pPr>
+      <w:r/>
+      <w:r>
+        <w:rPr>
+          <w:b/>
+        </w:rPr>
+        <w:t>Nom de Domaine :</w:t>
+      </w:r>
+      <w:r>
+        <w:t xml:space="preserve"> Acheté et configuré par le Concepteur. Aucun frais de remboursement ou d'acquisition n'est facturé aux Entrepreneurs au démarrage.</w:t>
+      </w:r>
+    </w:p>
+    <w:p>
+      <w:pPr>
+        <w:pStyle w:val="ListBullet"/>
+      </w:pPr>
+      <w:r/>
+      <w:r>
+        <w:rPr>
+          <w:b/>
+        </w:rPr>
+        <w:t>Hébergement applicatif :</w:t>
+      </w:r>
+      <w:r>
+        <w:t xml:space="preserve"> Déployé sur la plateforme Vercel (offre gratuite de démarrage).</w:t>
+      </w:r>
+    </w:p>
+    <w:p>
+      <w:pPr>
+        <w:pStyle w:val="ListBullet"/>
+      </w:pPr>
+      <w:r/>
+      <w:r>
+        <w:rPr>
+          <w:b/>
+        </w:rPr>
+        <w:t>Base de données et Authentification :</w:t>
+      </w:r>
+      <w:r>
+        <w:t xml:space="preserve"> Hébergées sur Supabase (offre gratuite de démarrage).</w:t>
+      </w:r>
+    </w:p>
+    <w:p>
+      <w:pPr>
+        <w:pStyle w:val="ListBullet"/>
+      </w:pPr>
+      <w:r/>
+      <w:r>
+        <w:rPr>
+          <w:b/>
+        </w:rPr>
+        <w:t>Stockage des fichiers (PDFs &amp; Reçus) :</w:t>
+      </w:r>
+      <w:r>
+        <w:t xml:space="preserve"> Stockés sur Supabase. Une migration gratuite vers Cloudflare R2 (10 Go gratuits) sera effectuée par le Concepteur.</w:t>
+      </w:r>
+    </w:p>
+    <w:p>
+      <w:pPr>
+        <w:pStyle w:val="ListBullet"/>
+      </w:pPr>
+      <w:r/>
+      <w:r>
+        <w:rPr>
+          <w:b/>
+        </w:rPr>
+        <w:t>Abonnements de Saison (Juillet - Octobre) :</w:t>
+      </w:r>
+      <w:r>
+        <w:t xml:space="preserve"> Si les quotas gratuits sont dépassés en cours d'année, les abonnements requis (ex : Supabase Pro à 25$/mois) seront à la charge des Entrepreneurs. Pour optimiser les coûts, le Concepteur proposes d'activer ces formules payantes </w:t>
+      </w:r>
+      <w:r>
+        <w:rPr>
+          <w:b/>
+        </w:rPr>
+        <w:t>uniquement durant les 3 mois de préparation active</w:t>
+      </w:r>
+      <w:r>
+        <w:t xml:space="preserve"> (juillet à octobre) et de les suspendre hors saison. Si les Entrepreneurs souhaitent maintenir le service payant actif toute l'année, ils en financeront l'intégralité des mensualités.</w:t>
+      </w:r>
+    </w:p>
+    <w:p>
+      <w:pPr>
+        <w:pStyle w:val="ListBullet"/>
+      </w:pPr>
+      <w:r/>
+      <w:r>
+        <w:rPr>
+          <w:b/>
+        </w:rPr>
+        <w:t>Responsabilité des Frais d'infrastructure :</w:t>
+      </w:r>
+      <w:r>
+        <w:t xml:space="preserve"> Tous les frais d'infrastructure et d'abonnements tiers restent à la charge exclusive des Entrepreneurs. Le Concepteur fournit sa main-d'œuvre de migration et d'intégration à titre gratuit.</w:t>
+      </w:r>
+    </w:p>
+    <w:p>
+      <w:r/>
+    </w:p>
+    <w:p>
+      <w:r>
+        <w:t>---</w:t>
+      </w:r>
+    </w:p>
+    <w:p>
+      <w:r/>
+    </w:p>
+    <w:p>
+      <w:pPr>
+        <w:pStyle w:val="Heading2"/>
+        <w:keepNext/>
+        <w:spacing w:before="240" w:after="120"/>
+      </w:pPr>
+      <w:r>
+        <w:rPr>
+          <w:rFonts w:ascii="Calibri Light" w:hAnsi="Calibri Light"/>
+          <w:b/>
+          <w:color w:val="000000"/>
+          <w:sz w:val="32"/>
+        </w:rPr>
+        <w:t>3. Tarification, Maintenance et Gestion des Données</w:t>
+      </w:r>
+    </w:p>
+    <w:p>
+      <w:r/>
+    </w:p>
+    <w:p>
+      <w:r>
+        <w:t>La tarification repose sur un partage de revenus équitable et l'utilisation autonome de la plateforme :</w:t>
+      </w:r>
+    </w:p>
+    <w:p>
+      <w:r/>
+    </w:p>
+    <w:p>
+      <w:pPr>
+        <w:pStyle w:val="ListBullet"/>
+      </w:pPr>
+      <w:r/>
+      <w:r>
+        <w:rPr>
+          <w:b/>
+        </w:rPr>
+        <w:t>Frais d'Installation initiaux :</w:t>
+      </w:r>
+      <w:r>
+        <w:t xml:space="preserve"> 0 FCFA (Aucun paiement initial. Les Entrepreneurs ne paient rien lors du lancement).</w:t>
+      </w:r>
+    </w:p>
+    <w:p>
+      <w:pPr>
+        <w:pStyle w:val="ListBullet"/>
+      </w:pPr>
+      <w:r/>
+      <w:r>
+        <w:rPr>
+          <w:b/>
+        </w:rPr>
+        <w:t>Commission Récurrente :</w:t>
+      </w:r>
+      <w:r>
+        <w:t xml:space="preserve"> 2 % sur le montant total de chaque transaction d'élève validée sur la plateforme. Règlement unique à la fin de la campagne annuelle de préparation (courant octobre).</w:t>
+      </w:r>
+    </w:p>
+    <w:p>
+      <w:pPr>
+        <w:pStyle w:val="ListBullet"/>
+      </w:pPr>
+      <w:r/>
+      <w:r>
+        <w:rPr>
+          <w:b/>
+        </w:rPr>
+        <w:t>Modification et Gestion des Informations :</w:t>
+      </w:r>
+      <w:r>
+        <w:t xml:space="preserve"> La plateforme intègre un CMS complet permettant de modifier toutes les informations du site (textes de la page d'accueil, coordonnées des centres, tarifs) et de gérer les profils (managers, administrateurs, candidats). </w:t>
+      </w:r>
+      <w:r>
+        <w:rPr>
+          <w:b/>
+        </w:rPr>
+        <w:t>Cette gestion et les mises à jour des données incombent exclusivement aux administrateurs et managers des Entrepreneurs</w:t>
+      </w:r>
+      <w:r>
+        <w:t>. Le Concepteur n'effectue aucune mise à jour d'information. Son rôle est strictement limité à la résolution des problèmes techniques et des bugs système.</w:t>
+      </w:r>
+    </w:p>
+    <w:p>
+      <w:pPr>
+        <w:pStyle w:val="ListBullet"/>
+      </w:pPr>
+      <w:r/>
+      <w:r>
+        <w:rPr>
+          <w:b/>
+        </w:rPr>
+        <w:t>Maintenance Incluse :</w:t>
+      </w:r>
+      <w:r>
+        <w:t xml:space="preserve"> Le Concepteur assure gratuitement la correction des anomalies bloquantes et la mise à jour de l'année scolaire de référence.</w:t>
+      </w:r>
+    </w:p>
+    <w:p>
+      <w:pPr>
+        <w:pStyle w:val="ListBullet"/>
+      </w:pPr>
+      <w:r/>
+      <w:r>
+        <w:rPr>
+          <w:b/>
+        </w:rPr>
+        <w:t>SLA (Support) :</w:t>
+      </w:r>
+      <w:r>
+        <w:t xml:space="preserve"> De juillet à octobre, assistance technique en cas de panne critique sous 4 heures ouvrables (8h00 - 20h00). Demandes nocturnes ou non critiques traitées le lendemain.</w:t>
+      </w:r>
+    </w:p>
+    <w:p>
+      <w:pPr>
+        <w:pStyle w:val="ListBullet"/>
+      </w:pPr>
+      <w:r/>
+      <w:r>
+        <w:rPr>
+          <w:b/>
+        </w:rPr>
+        <w:t>Évolutions majeures :</w:t>
+      </w:r>
+      <w:r>
+        <w:t xml:space="preserve"> Facturées au forfait après devis écrit ou compensées par une hausse de commission mutuellement convenue (ex : passage de 2 % à 2.5 % ou 3 % selon la complexité).</w:t>
+      </w:r>
+    </w:p>
+    <w:p>
+      <w:r/>
+    </w:p>
+    <w:p>
+      <w:r>
+        <w:t>---</w:t>
+      </w:r>
+    </w:p>
+    <w:p>
+      <w:r/>
+    </w:p>
+    <w:p>
+      <w:pPr>
+        <w:pStyle w:val="Heading2"/>
+        <w:keepNext/>
+        <w:spacing w:before="240" w:after="120"/>
+      </w:pPr>
+      <w:r>
+        <w:rPr>
+          <w:rFonts w:ascii="Calibri Light" w:hAnsi="Calibri Light"/>
+          <w:b/>
+          <w:color w:val="000000"/>
+          <w:sz w:val="32"/>
+        </w:rPr>
+        <w:t>4. Clauses Particulières de Protection du Concepteur</w:t>
+      </w:r>
+    </w:p>
+    <w:p>
+      <w:r/>
+    </w:p>
+    <w:p>
+      <w:r>
+        <w:t>Compte tenu de la valeur de la plateforme développée (estimée entre 2 000 000 FCFA et 10 000 000 FCFA) et du temps investi, les clauses suivantes sont intégrées :</w:t>
+      </w:r>
+    </w:p>
+    <w:p>
+      <w:r/>
+    </w:p>
+    <w:p>
+      <w:pPr>
+        <w:pStyle w:val="ListBullet"/>
+      </w:pPr>
+      <w:r/>
+      <w:r>
+        <w:rPr>
+          <w:b/>
+        </w:rPr>
+        <w:t>A. Clause d'Engagement de Dix (10) Ans Obligatoire :</w:t>
+      </w:r>
+      <w:r>
+        <w:t xml:space="preserve"> Les Entrepreneurs s'engagent à utiliser la solution logicielle de manière exclusive pendant 10 ans. Remplacement ou contournement par une autre solution interdits durant cette période.</w:t>
+      </w:r>
+    </w:p>
+    <w:p>
+      <w:pPr>
+        <w:pStyle w:val="ListBullet"/>
+      </w:pPr>
+      <w:r/>
+      <w:r>
+        <w:rPr>
+          <w:b/>
+        </w:rPr>
+        <w:t>B. Clause de Pénalité et Rupture d'Engagement :</w:t>
+      </w:r>
+      <w:r>
+        <w:t xml:space="preserve"> Si les Entrepreneurs résilient le contrat, migrent vers un autre outil (interne ou externe) avant l'échéance de 10 ans, </w:t>
+      </w:r>
+      <w:r>
+        <w:rPr>
+          <w:b/>
+        </w:rPr>
+        <w:t>ou s'ils décident d'arrêter définitivement les cours en ligne ou de ne plus utiliser de plateforme en ligne</w:t>
+      </w:r>
+      <w:r>
+        <w:t>, ils seront redevables au Concepteur de :</w:t>
+      </w:r>
+    </w:p>
+    <w:p>
+      <w:r>
+        <w:t xml:space="preserve">1. Une pénalité forfaitaire et immédiate de </w:t>
+      </w:r>
+      <w:r>
+        <w:rPr>
+          <w:b/>
+        </w:rPr>
+        <w:t>500 000 FCFA</w:t>
+      </w:r>
+      <w:r>
+        <w:t xml:space="preserve"> pour rupture unilatérale.</w:t>
+      </w:r>
+    </w:p>
+    <w:p>
+      <w:r>
+        <w:t xml:space="preserve">2. Une commission réparatrice de </w:t>
+      </w:r>
+      <w:r>
+        <w:rPr>
+          <w:b/>
+        </w:rPr>
+        <w:t>douze pour cent (12 %)</w:t>
+      </w:r>
+      <w:r>
+        <w:t xml:space="preserve"> sur chaque inscription validée via tout autre support ou méthode alternative jusqu'au terme initial des 10 ans.</w:t>
+      </w:r>
+    </w:p>
+    <w:p>
+      <w:pPr>
+        <w:pStyle w:val="ListBullet"/>
+      </w:pPr>
+      <w:r/>
+      <w:r>
+        <w:rPr>
+          <w:b/>
+        </w:rPr>
+        <w:t>C. Centralisation des Inscriptions :</w:t>
+      </w:r>
+      <w:r>
+        <w:t xml:space="preserve"> Tous les candidats (formules En Ligne et Présentiel) doivent obligatoirement s'inscrire via la plateforme. Aucun paiement d'élève 'hors-système' n'est autorisé.</w:t>
+      </w:r>
+    </w:p>
+    <w:p>
+      <w:pPr>
+        <w:pStyle w:val="ListBullet"/>
+      </w:pPr>
+      <w:r/>
+      <w:r>
+        <w:rPr>
+          <w:b/>
+        </w:rPr>
+        <w:t>D. Limitation de Responsabilité Financière :</w:t>
+      </w:r>
+      <w:r>
+        <w:t xml:space="preserve"> En cas d'interruption accidentelle ou perte de données, la responsabilité financière cumulée du Concepteur est expressément plafonnée au montant de </w:t>
+      </w:r>
+      <w:r>
+        <w:rPr>
+          <w:b/>
+        </w:rPr>
+        <w:t>1 %</w:t>
+      </w:r>
+      <w:r>
+        <w:t xml:space="preserve"> des commissions perçues ou dues pour la campagne annuelle en cours.</w:t>
+      </w:r>
+    </w:p>
+    <w:p>
+      <w:r/>
+    </w:p>
+    <w:p>
+      <w:r>
+        <w:t>---</w:t>
+      </w:r>
+    </w:p>
+    <w:p>
+      <w:r/>
+    </w:p>
+    <w:p>
+      <w:pPr>
+        <w:pStyle w:val="Heading2"/>
+        <w:keepNext/>
+        <w:spacing w:before="240" w:after="120"/>
+      </w:pPr>
+      <w:r>
+        <w:rPr>
+          <w:rFonts w:ascii="Calibri Light" w:hAnsi="Calibri Light"/>
+          <w:b/>
+          <w:color w:val="000000"/>
+          <w:sz w:val="32"/>
+        </w:rPr>
+        <w:t>5. Contrat de Partenariat Juridique</w:t>
+      </w:r>
+    </w:p>
+    <w:p>
+      <w:r/>
+    </w:p>
+    <w:p>
+      <w:pPr>
+        <w:pStyle w:val="Heading3"/>
+        <w:keepNext/>
+        <w:spacing w:before="240" w:after="120"/>
+      </w:pPr>
+      <w:r>
+        <w:rPr>
+          <w:rFonts w:ascii="Calibri Light" w:hAnsi="Calibri Light"/>
+          <w:b/>
+          <w:color w:val="000000"/>
+          <w:sz w:val="26"/>
+        </w:rPr>
+        <w:t>ENTRE LES SOUSSIGNÉS :</w:t>
+      </w:r>
+    </w:p>
+    <w:p>
+      <w:r>
+        <w:t>M. Sidoine K. (krsidoine7@gmail.com | +225 0503681588), ci-après désigné « Le Concepteur ».</w:t>
+      </w:r>
+    </w:p>
+    <w:p>
+      <w:r/>
+    </w:p>
+    <w:p>
+      <w:r>
+        <w:t>Et l'entité OGE Académie, représentée conjointement par ses deux entrepreneurs co-fondateurs : M. [Nom de l'Entrepreneur 1] et M. [Nom de l'Entrepreneur 2], ci-après désignés « Les Entrepreneurs ».</w:t>
+      </w:r>
+    </w:p>
+    <w:p>
+      <w:r/>
+    </w:p>
+    <w:p>
+      <w:pPr>
+        <w:pStyle w:val="Heading3"/>
+        <w:keepNext/>
+        <w:spacing w:before="240" w:after="120"/>
+      </w:pPr>
+      <w:r>
+        <w:rPr>
+          <w:rFonts w:ascii="Calibri Light" w:hAnsi="Calibri Light"/>
+          <w:b/>
+          <w:color w:val="000000"/>
+          <w:sz w:val="26"/>
+        </w:rPr>
+        <w:t>IL A ÉTÉ CONVENU CE QUI SUIT :</w:t>
+      </w:r>
+    </w:p>
+    <w:p>
+      <w:r/>
+    </w:p>
+    <w:p>
+      <w:r/>
+      <w:r>
+        <w:rPr>
+          <w:b/>
+        </w:rPr>
+        <w:t>Article 1 : Objet du contrat</w:t>
+      </w:r>
+      <w:r/>
+    </w:p>
+    <w:p>
+      <w:r>
+        <w:t>Le présent contrat a pour objet la mise à disposition exclusive et l'intégration de la plateforme web OGE Académie par le Concepteur au profit des Entrepreneurs pour la gestion en ligne et en présentiel (avec l'appui d'enseignants) de ses préparations aux concours.</w:t>
+      </w:r>
+    </w:p>
+    <w:p>
+      <w:r/>
+    </w:p>
+    <w:p>
+      <w:r/>
+      <w:r>
+        <w:rPr>
+          <w:b/>
+        </w:rPr>
+        <w:t>Article 2 : Conditions Financières &amp; Hébergement</w:t>
+      </w:r>
+      <w:r/>
+    </w:p>
+    <w:p>
+      <w:pPr>
+        <w:pStyle w:val="ListBullet"/>
+      </w:pPr>
+      <w:r/>
+      <w:r>
+        <w:rPr>
+          <w:b/>
+        </w:rPr>
+        <w:t>Frais initiaux :</w:t>
+      </w:r>
+      <w:r>
+        <w:t xml:space="preserve"> Aucun frais d'installation ni de mise en route (0 FCFA).</w:t>
+      </w:r>
+    </w:p>
+    <w:p>
+      <w:pPr>
+        <w:pStyle w:val="ListBullet"/>
+      </w:pPr>
+      <w:r/>
+      <w:r>
+        <w:rPr>
+          <w:b/>
+        </w:rPr>
+        <w:t>Redevance :</w:t>
+      </w:r>
+      <w:r>
+        <w:t xml:space="preserve"> Les Entrepreneurs verseront 2% sur chaque paiement d'élève validé (En Ligne et Présentiel). Versement unique en fin de campagne (courant octobre).</w:t>
+      </w:r>
+    </w:p>
+    <w:p>
+      <w:pPr>
+        <w:pStyle w:val="ListBullet"/>
+      </w:pPr>
+      <w:r/>
+      <w:r>
+        <w:rPr>
+          <w:b/>
+        </w:rPr>
+        <w:t>Hébergement :</w:t>
+      </w:r>
+      <w:r>
+        <w:t xml:space="preserve"> En cas de dépassement des quotas, les Entrepreneurs financent les abonnements. Pour optimiser les coûts, le Concepteur propose d'activer ces formules payantes uniquement durant la saison active de juillet à octobre (3 mois).</w:t>
+      </w:r>
+    </w:p>
+    <w:p>
+      <w:r/>
+    </w:p>
+    <w:p>
+      <w:r/>
+      <w:r>
+        <w:rPr>
+          <w:b/>
+        </w:rPr>
+        <w:t>Article 3 : Maintenance, Évolutions et CMS</w:t>
+      </w:r>
+      <w:r/>
+    </w:p>
+    <w:p>
+      <w:pPr>
+        <w:pStyle w:val="ListBullet"/>
+      </w:pPr>
+      <w:r>
+        <w:t>Les corrections de bugs sont incluses. Les nouvelles fonctionnalités feront l'objet d'un forfait ou d'une revalorisation de la commission.</w:t>
+      </w:r>
+    </w:p>
+    <w:p>
+      <w:pPr>
+        <w:pStyle w:val="ListBullet"/>
+      </w:pPr>
+      <w:r>
+        <w:t>La gestion, modification et mise à jour de toutes les informations stockées (données des candidats, managers, admins et textes de la page d'accueil) sont de la responsabilité exclusive des Entrepreneurs via leur dashboard CMS. Le Concepteur n'intervient que pour les dysfonctionnements techniques.</w:t>
+      </w:r>
+    </w:p>
+    <w:p>
+      <w:r/>
+    </w:p>
+    <w:p>
+      <w:r/>
+      <w:r>
+        <w:rPr>
+          <w:b/>
+        </w:rPr>
+        <w:t>Article 4 : Durée d'Engagement &amp; Exclusivité (10 Ans)</w:t>
+      </w:r>
+      <w:r/>
+    </w:p>
+    <w:p>
+      <w:r>
+        <w:t>Le contrat est conclu pour une durée ferme de dix (10) ans. Les Entrepreneurs s'engagent à utiliser exclusivement la solution du Concepteur durant cette période.</w:t>
+      </w:r>
+    </w:p>
+    <w:p>
+      <w:r/>
+    </w:p>
+    <w:p>
+      <w:r/>
+      <w:r>
+        <w:rPr>
+          <w:b/>
+        </w:rPr>
+        <w:t>Article 5 : Résiliation, Arrêt de Service &amp; Pénalités</w:t>
+      </w:r>
+      <w:r/>
+    </w:p>
+    <w:p>
+      <w:r>
+        <w:t>En cas de rupture anticipée du contrat, d'utilisation d'une plateforme concurrente avant le terme de 10 ans, ou en cas de décision des Entrepreneurs d'arrêter définitivement l'usage de plateformes en ligne ou de cours en ligne, ces derniers s'engagent solidairement à verser au Concepteur :</w:t>
+      </w:r>
+    </w:p>
+    <w:p>
+      <w:r>
+        <w:t xml:space="preserve">1. Une pénalité fixe de rupture de </w:t>
+      </w:r>
+      <w:r>
+        <w:rPr>
+          <w:b/>
+        </w:rPr>
+        <w:t>500 000 FCFA</w:t>
+      </w:r>
+      <w:r>
+        <w:t>.</w:t>
+      </w:r>
+    </w:p>
+    <w:p>
+      <w:r>
+        <w:t xml:space="preserve">2. Une indemnité mensuelle de </w:t>
+      </w:r>
+      <w:r>
+        <w:rPr>
+          <w:b/>
+        </w:rPr>
+        <w:t>12 %</w:t>
+      </w:r>
+      <w:r>
+        <w:t xml:space="preserve"> du montant de chaque inscription enregistrée via toute méthode alternative jusqu'au terme de l'engagement de 10 ans.</w:t>
+      </w:r>
+    </w:p>
+    <w:p>
+      <w:r/>
+    </w:p>
+    <w:p>
+      <w:r/>
+      <w:r>
+        <w:rPr>
+          <w:b/>
+        </w:rPr>
+        <w:t>Article 6 : Propriété Intellectuelle</w:t>
+      </w:r>
+      <w:r/>
+    </w:p>
+    <w:p>
+      <w:r>
+        <w:t>Le code source, le design et les bases de données restent la propriété du Concepteur. Les supports de cours et les données des élèves restent la propriété des Entrepreneurs.</w:t>
+      </w:r>
+    </w:p>
+    <w:p>
+      <w:r/>
+    </w:p>
+    <w:p>
+      <w:r/>
+      <w:r>
+        <w:rPr>
+          <w:b/>
+        </w:rPr>
+        <w:t>Article 7 : SLA &amp; Limitation de Responsabilité</w:t>
+      </w:r>
+      <w:r/>
+    </w:p>
+    <w:p>
+      <w:pPr>
+        <w:pStyle w:val="ListBullet"/>
+      </w:pPr>
+      <w:r/>
+      <w:r>
+        <w:rPr>
+          <w:b/>
+        </w:rPr>
+        <w:t>SLA :</w:t>
+      </w:r>
+      <w:r>
+        <w:t xml:space="preserve"> Assistance technique en cas de panne critique sous 4 heures ouvrables (8h - 20h) de juillet à octobre.</w:t>
+      </w:r>
+    </w:p>
+    <w:p>
+      <w:pPr>
+        <w:pStyle w:val="ListBullet"/>
+      </w:pPr>
+      <w:r/>
+      <w:r>
+        <w:rPr>
+          <w:b/>
+        </w:rPr>
+        <w:t>Plafond de Responsabilité :</w:t>
+      </w:r>
+      <w:r>
+        <w:t xml:space="preserve"> La responsabilité totale du Concepteur est expressément plafonnée à </w:t>
+      </w:r>
+      <w:r>
+        <w:rPr>
+          <w:b/>
+        </w:rPr>
+        <w:t>1 %</w:t>
+      </w:r>
+      <w:r>
+        <w:t xml:space="preserve"> des commissions perçues en exécution du présent contrat sur la campagne annuelle concernée.</w:t>
+      </w:r>
+    </w:p>
+    <w:p>
+      <w:r/>
+    </w:p>
+    <w:p>
+      <w:r>
+        <w:t>---</w:t>
+      </w:r>
+    </w:p>
+    <w:p>
+      <w:r/>
+    </w:p>
+    <w:p>
+      <w:r>
+        <w:t>Fait à [Ville], le [Date]</w:t>
+      </w:r>
+    </w:p>
+    <w:p>
+      <w:r/>
+    </w:p>
+    <w:tbl>
+      <w:tblPr>
+        <w:tblStyle w:val="TableGrid"/>
+        <w:tblW w:type="auto" w:w="0"/>
+        <w:tblLook w:firstColumn="1" w:firstRow="1" w:lastColumn="0" w:lastRow="0" w:noHBand="0" w:noVBand="1" w:val="04A0"/>
+      </w:tblPr>
+      <w:tblGrid>
+        <w:gridCol w:w="4680"/>
+        <w:gridCol w:w="4680"/>
+      </w:tblGrid>
+      <w:tr>
+        <w:trPr>
+          <w:cantSplit/>
+          <w:tblHeader/>
+        </w:trPr>
+        <w:tc>
+          <w:tcPr>
+            <w:tcW w:type="dxa" w:w="4680"/>
+            <w:tcMar>
+              <w:top w:w="140" w:type="dxa"/>
+              <w:bottom w:w="140" w:type="dxa"/>
+              <w:left w:w="180" w:type="dxa"/>
+              <w:right w:w="180" w:type="dxa"/>
+            </w:tcMar>
+            <w:shd w:fill="FF7900"/>
+          </w:tcPr>
+          <w:p>
+            <w:pPr>
+              <w:jc w:val="center"/>
+            </w:pPr>
+            <w:r>
+              <w:rPr>
+                <w:b/>
+                <w:color w:val="FFFFFF"/>
+              </w:rPr>
+              <w:t>Pour Le Concepteur</w:t>
+            </w:r>
+          </w:p>
+        </w:tc>
+        <w:tc>
+          <w:tcPr>
+            <w:tcW w:type="dxa" w:w="4680"/>
+            <w:tcMar>
+              <w:top w:w="140" w:type="dxa"/>
+              <w:bottom w:w="140" w:type="dxa"/>
+              <w:left w:w="180" w:type="dxa"/>
+              <w:right w:w="180" w:type="dxa"/>
+            </w:tcMar>
+            <w:shd w:fill="FF7900"/>
+          </w:tcPr>
+          <w:p>
+            <w:pPr>
+              <w:jc w:val="center"/>
+            </w:pPr>
+            <w:r>
+              <w:rPr>
+                <w:b/>
+                <w:color w:val="FFFFFF"/>
+              </w:rPr>
+              <w:t>Pour Les Entrepreneurs d'OGE Académie</w:t>
             </w:r>
           </w:p>
         </w:tc>
@@ -153,7 +1223,7 @@
               <w:jc w:val="left"/>
             </w:pPr>
             <w:r>
-              <w:t>Auteur &amp; Concepteur :</w:t>
+              <w:t>M. Sidoine K.</w:t>
             </w:r>
           </w:p>
         </w:tc>
@@ -173,7 +1243,7 @@
               <w:jc w:val="left"/>
             </w:pPr>
             <w:r>
-              <w:t>M. Sidoine K. (krsidoine7@gmail.com</w:t>
+              <w:t>M. / Mme [Nom de l'Entrepreneur 1]</w:t>
             </w:r>
           </w:p>
         </w:tc>
@@ -197,7 +1267,7 @@
               <w:jc w:val="left"/>
             </w:pPr>
             <w:r>
-              <w:t>Date d'effet :</w:t>
+              <w:t>(Signature et mention "Lu et approuvé")</w:t>
             </w:r>
           </w:p>
         </w:tc>
@@ -216,7 +1286,7 @@
               <w:jc w:val="left"/>
             </w:pPr>
             <w:r>
-              <w:t>Juin 2026</w:t>
+              <w:t>(Signature et mention "Lu et approuvé")</w:t>
             </w:r>
           </w:p>
         </w:tc>
@@ -240,9 +1310,7 @@
             <w:pPr>
               <w:jc w:val="left"/>
             </w:pPr>
-            <w:r>
-              <w:t>Durée d'engagement :</w:t>
-            </w:r>
+            <w:r/>
           </w:p>
         </w:tc>
         <w:tc>
@@ -261,620 +1329,7 @@
               <w:jc w:val="left"/>
             </w:pPr>
             <w:r>
-              <w:t>5 ans ferme (avec clause d'exclusivité et pénalité de sortie)</w:t>
-            </w:r>
-          </w:p>
-        </w:tc>
-      </w:tr>
-    </w:tbl>
-    <w:p>
-      <w:pPr>
-        <w:spacing w:before="120"/>
-      </w:pPr>
-    </w:p>
-    <w:p>
-      <w:r/>
-    </w:p>
-    <w:p>
-      <w:r/>
-    </w:p>
-    <w:p>
-      <w:r/>
-      <w:r>
-        <w:rPr>
-          <w:b/>
-        </w:rPr>
-        <w:t>1. Présentation de la Solution OGE Académie</w:t>
-      </w:r>
-      <w:r/>
-    </w:p>
-    <w:p>
-      <w:r/>
-    </w:p>
-    <w:p>
-      <w:r>
-        <w:t>Ce projet représente le fruit d'un travail intensif de conception et de développement, appuyé par plus d'un an d'expérience métier du concepteur. OGE Académie est une plateforme web robuste gérée par des entrepreneurs avec le précieux concours d'enseignants. Elle résout trois problématiques cruciales : la gestion en ligne et en présentiel des candidats, le traitement des flux de paiement locaux, et la protection absolue contre le vol des cours PDF grâce à un système de sécurité DRM avancé de niveau entreprise.</w:t>
-      </w:r>
-    </w:p>
-    <w:p>
-      <w:r/>
-    </w:p>
-    <w:p>
-      <w:r/>
-      <w:r>
-        <w:rPr>
-          <w:b/>
-        </w:rPr>
-        <w:t>2. Stratégie d'Hébergement et Optimisation des Coûts</w:t>
-      </w:r>
-      <w:r/>
-    </w:p>
-    <w:p>
-      <w:r/>
-    </w:p>
-    <w:p>
-      <w:r>
-        <w:t>Afin de démarrer le projet de manière économe, l'architecture a été conçue pour maximiser l'usage des offres gratuites et optimiser le budget technique :</w:t>
-      </w:r>
-    </w:p>
-    <w:p>
-      <w:r/>
-    </w:p>
-    <w:p>
-      <w:pPr>
-        <w:pStyle w:val="ListBullet"/>
-      </w:pPr>
-      <w:r>
-        <w:t>Nom de Domaine : Le nom de domaine sera acheté et configuré par le Concepteur. Aucun frais de remboursement ou d'acquisition n'est facturé aux Entrepreneurs au démarrage.</w:t>
-      </w:r>
-    </w:p>
-    <w:p>
-      <w:pPr>
-        <w:pStyle w:val="ListBullet"/>
-      </w:pPr>
-      <w:r>
-        <w:t>Hébergement de l'application : Actuellement hébergée gratuitement sur la plateforme Vercel, garantissant une disponibilité permanente à moindres frais.</w:t>
-      </w:r>
-    </w:p>
-    <w:p>
-      <w:pPr>
-        <w:pStyle w:val="ListBullet"/>
-      </w:pPr>
-      <w:r>
-        <w:t>Base de données et Authentification : Gérées via Supabase (offre gratuite pour le démarrage).</w:t>
-      </w:r>
-    </w:p>
-    <w:p>
-      <w:pPr>
-        <w:pStyle w:val="ListBullet"/>
-      </w:pPr>
-      <w:r>
-        <w:t>Stockage des fichiers (PDFs &amp; Reçus) : Les fichiers sont temporairement stockés sur Supabase. Une migration vers Cloudflare R2 (qui propose 10 Go de stockage gratuit) sera effectuée par le Concepteur. Le Concepteur s'engage à réaliser cette migration technique gratuitement.</w:t>
-      </w:r>
-    </w:p>
-    <w:p>
-      <w:pPr>
-        <w:pStyle w:val="ListBullet"/>
-      </w:pPr>
-      <w:r>
-        <w:t>Abonnements de Saison (Juillet - Octobre) : Si la plateforme dépasse les quotas gratuits en cours d'année, les abonnements payants requis (ex : Supabase Pro à 25$/mois) seront activés uniquement sur la période de préparation active (de juillet à octobre, soit 2 à 3 mois) pour réduire au maximum les coûts annuels.</w:t>
-      </w:r>
-    </w:p>
-    <w:p>
-      <w:pPr>
-        <w:pStyle w:val="ListBullet"/>
-      </w:pPr>
-      <w:r>
-        <w:t>Responsabilité des Frais d'infrastructure : En cas de changement d'hébergeur, d'augmentation du trafic ou d'abonnements payants (Vercel, Supabase, Cloudflare), tous les frais de licences et d'infrastructure sont à la charge exclusive des Entrepreneurs. Le Concepteur assurera l'implémentation et les migrations techniques sans facturer de rémunération supplémentaire de main-d'œuvre.</w:t>
-      </w:r>
-    </w:p>
-    <w:p>
-      <w:r/>
-    </w:p>
-    <w:p>
-      <w:r/>
-      <w:r>
-        <w:rPr>
-          <w:b/>
-        </w:rPr>
-        <w:t>3. Tarification, Maintenance et Évolutions Majeures</w:t>
-      </w:r>
-      <w:r/>
-    </w:p>
-    <w:p>
-      <w:r/>
-    </w:p>
-    <w:p>
-      <w:r>
-        <w:t>La tarification repose sur un partage de revenus équitable de 2% sur chaque inscription validée :</w:t>
-      </w:r>
-    </w:p>
-    <w:p>
-      <w:r/>
-    </w:p>
-    <w:p>
-      <w:r/>
-      <w:r>
-        <w:rPr>
-          <w:b/>
-        </w:rPr>
-        <w:t xml:space="preserve">• Frais d'Installation initiaux : </w:t>
-      </w:r>
-      <w:r>
-        <w:t>0 FCFA (Aucun paiement initial ni frais de mise en route. Les Entrepreneurs ne paient rien lors du lancement de la plateforme).</w:t>
-      </w:r>
-    </w:p>
-    <w:p>
-      <w:r/>
-      <w:r>
-        <w:rPr>
-          <w:b/>
-        </w:rPr>
-        <w:t xml:space="preserve">• Commission Récurrente : </w:t>
-      </w:r>
-      <w:r>
-        <w:t>2 % sur le montant total de chaque transaction d'élève validée sur la plateforme. Le règlement de cette redevance s'effectuera en un versement unique à la fin de la campagne annuelle de préparation (courant octobre) après consolidation des comptes.</w:t>
-      </w:r>
-    </w:p>
-    <w:p>
-      <w:r/>
-      <w:r>
-        <w:rPr>
-          <w:b/>
-        </w:rPr>
-        <w:t xml:space="preserve">• Maintenance &amp; Ajustements Mineurs (Inclus) : </w:t>
-      </w:r>
-      <w:r>
-        <w:t>Le Concepteur prend en charge gratuitement les corrections de bugs, changements de logos, mises à jour simples de textes, et mise à jour de l'année scolaire de référence.</w:t>
-      </w:r>
-    </w:p>
-    <w:p>
-      <w:r/>
-      <w:r>
-        <w:rPr>
-          <w:b/>
-        </w:rPr>
-        <w:t xml:space="preserve">• Délais de Support &amp; Réaction (SLA) : </w:t>
-      </w:r>
-      <w:r>
-        <w:t>Pendant la haute saison active (juillet à octobre), le Concepteur garantit une assistance technique en cas de panne critique bloquante de la plateforme sous 4 heures ouvrables (entre 8h00 et 20h00). Les demandes non critiques ou formulées de nuit seront traitées le jour ouvrable suivant.</w:t>
-      </w:r>
-    </w:p>
-    <w:p>
-      <w:r/>
-      <w:r>
-        <w:rPr>
-          <w:b/>
-        </w:rPr>
-        <w:t xml:space="preserve">• Processus d'Évolution (Nouvelles fonctionnalités) : </w:t>
-      </w:r>
-      <w:r>
-        <w:t>Toute demande de nouvelle fonctionnalité majeure doit être formulée par écrit par les Entrepreneurs. Le Concepteur analysera la demande et renverra sous quelques jours un document d'étude présentant les avantages, les inconvénients, et le prix d'implémentation (au forfait).</w:t>
-      </w:r>
-    </w:p>
-    <w:p>
-      <w:r/>
-      <w:r>
-        <w:rPr>
-          <w:b/>
-        </w:rPr>
-        <w:t xml:space="preserve">• Option Alternative sur Pourcentage : </w:t>
-      </w:r>
-      <w:r>
-        <w:t>Si les Entrepreneurs souhaitent ajouter une nouvelle fonctionnalité majeure mais ne souhaitent pas la payer au forfait, les parties pourront convenir d'augmenter le pourcentage de commission par candidat (ex: passer de 2% à 2.5% ou 3% selon la complexité du module).</w:t>
-      </w:r>
-    </w:p>
-    <w:p>
-      <w:r/>
-    </w:p>
-    <w:p>
-      <w:r/>
-    </w:p>
-    <w:p>
-      <w:r/>
-      <w:r>
-        <w:rPr>
-          <w:b/>
-        </w:rPr>
-        <w:t>4. Clauses Particulières de Protection du Concepteur</w:t>
-      </w:r>
-      <w:r/>
-    </w:p>
-    <w:p>
-      <w:r/>
-    </w:p>
-    <w:p>
-      <w:r>
-        <w:t>Parce que ce projet a nécessité un investissement de temps considérable et possède une valeur intrinsèque estimée entre 2 000 000 FCFA et 10 000 000 FCFA sur le marché actuel, les clauses d'engagement et de limitation de responsabilité suivantes sont obligatoires :</w:t>
-      </w:r>
-    </w:p>
-    <w:p>
-      <w:r/>
-    </w:p>
-    <w:p>
-      <w:r/>
-      <w:r>
-        <w:rPr>
-          <w:b/>
-        </w:rPr>
-        <w:t>A. Clause d'Engagement de 5 Ans Obligatoire</w:t>
-      </w:r>
-      <w:r/>
-    </w:p>
-    <w:p>
-      <w:r>
-        <w:t>Les Entrepreneurs s'engagent à utiliser la solution logicielle fournie par le Concepteur de manière exclusive pendant une période minimale de cinq (5) ans à compter de la date de mise en service. Pendant ces 5 ans, il est interdit de remplacer la plateforme par une autre solution interne ou externe.</w:t>
-      </w:r>
-    </w:p>
-    <w:p>
-      <w:r/>
-    </w:p>
-    <w:p>
-      <w:r/>
-      <w:r>
-        <w:rPr>
-          <w:b/>
-        </w:rPr>
-        <w:t>B. Clause de Pénalité en cas de Changement de Plateforme</w:t>
-      </w:r>
-      <w:r/>
-    </w:p>
-    <w:p>
-      <w:r>
-        <w:t>Si, au cours de la période d'engagement de 5 ans, les Entrepreneurs résilient le présent contrat, cessent d'utiliser la solution du Concepteur ou utilisent une autre plateforme (développée en interne ou par un tiers), les Entrepreneurs resteront légalement redevables au Concepteur d'une pénalité financière.</w:t>
-      </w:r>
-    </w:p>
-    <w:p>
-      <w:r>
-        <w:t>Cette pénalité sera de cinq pour cent (5%) sur le montant de chaque inscription enregistrée et validée via la nouvelle plateforme utilisée, et ce jusqu'à l'expiration du délai initial de 5 ans.</w:t>
-      </w:r>
-    </w:p>
-    <w:p>
-      <w:r/>
-    </w:p>
-    <w:p>
-      <w:r/>
-      <w:r>
-        <w:rPr>
-          <w:b/>
-        </w:rPr>
-        <w:t>C. Clause de Centralisation Obligatoire des Paiements</w:t>
-      </w:r>
-      <w:r/>
-    </w:p>
-    <w:p>
-      <w:r>
-        <w:t>Afin de garantir le calcul juste de la redevance de 2%, tous les élèves inscrits à la préparation, qu'ils choisissent le mode de formation En Ligne ou Présentiel (formation physique avec enseignants), doivent impérativement être enregistrés sur la plateforme. Leurs reçus de paiement doivent obligatoirement être téléchargés et validés par les managers via l'interface d'administration. Aucun paiement d'élève 'hors-système' ne sera autorisé.</w:t>
-      </w:r>
-    </w:p>
-    <w:p>
-      <w:r/>
-    </w:p>
-    <w:p>
-      <w:r/>
-      <w:r>
-        <w:rPr>
-          <w:b/>
-        </w:rPr>
-        <w:t>D. Limitation de Responsabilité Financière</w:t>
-      </w:r>
-      <w:r/>
-    </w:p>
-    <w:p>
-      <w:r>
-        <w:t>En cas d'interruption accidentelle de service, de dysfonctionnement technique ou de perte de données, la responsabilité financière cumulée du Concepteur est expressément plafonnée au montant total des commissions de 2 % perçues ou dues pour la campagne annuelle en cours.</w:t>
-      </w:r>
-    </w:p>
-    <w:p>
-      <w:r/>
-    </w:p>
-    <w:p>
-      <w:r/>
-    </w:p>
-    <w:p>
-      <w:r/>
-      <w:r>
-        <w:rPr>
-          <w:b/>
-        </w:rPr>
-        <w:t>5. Contrat de Partenariat Juridique</w:t>
-      </w:r>
-      <w:r/>
-    </w:p>
-    <w:p>
-      <w:r/>
-    </w:p>
-    <w:p>
-      <w:r>
-        <w:t>ENTRE LES SOUSSIGNÉS :</w:t>
-      </w:r>
-    </w:p>
-    <w:p>
-      <w:r/>
-    </w:p>
-    <w:p>
-      <w:r>
-        <w:t>M. Sidoine K. (krsidoine7@gmail.com | +225 0503681588), ci-après désigné « Le Concepteur ».</w:t>
-      </w:r>
-    </w:p>
-    <w:p>
-      <w:r/>
-    </w:p>
-    <w:p>
-      <w:r>
-        <w:t>Et l'entité OGE Académie, représentée conjointement par ses deux entrepreneurs co-fondateurs : M. [Nom de l'Entrepreneur 1] et M. [Nom de l'Entrepreneur 2], ci-après désignés « Les Entrepreneurs ».</w:t>
-      </w:r>
-    </w:p>
-    <w:p>
-      <w:r/>
-    </w:p>
-    <w:p>
-      <w:r>
-        <w:t>IL A ÉTÉ CONVENU CE QUI SUIT :</w:t>
-      </w:r>
-    </w:p>
-    <w:p>
-      <w:r/>
-    </w:p>
-    <w:p>
-      <w:r/>
-    </w:p>
-    <w:p>
-      <w:r/>
-      <w:r>
-        <w:rPr>
-          <w:b/>
-        </w:rPr>
-        <w:t>Article 1 : Objet du contrat</w:t>
-      </w:r>
-      <w:r/>
-    </w:p>
-    <w:p>
-      <w:r>
-        <w:t>Le présent contrat a pour objet la mise à disposition exclusive et l'intégration de la plateforme web OGE Académie par le Concepteur au profit des Entrepreneurs pour la gestion en ligne et en présentiel (avec l'appui d'enseignants) de ses préparations aux concours.</w:t>
-      </w:r>
-    </w:p>
-    <w:p>
-      <w:r/>
-    </w:p>
-    <w:p>
-      <w:r/>
-      <w:r>
-        <w:rPr>
-          <w:b/>
-        </w:rPr>
-        <w:t>Article 2 : Conditions Financières &amp; Hébergement</w:t>
-      </w:r>
-      <w:r/>
-    </w:p>
-    <w:p>
-      <w:r>
-        <w:t>• Frais initiaux : Aucun frais d'installation ni de mise en route (0 FCFA). Les Entrepreneurs ne paient aucun montant initial à la signature.</w:t>
-      </w:r>
-    </w:p>
-    <w:p>
-      <w:r>
-        <w:t>• Redevance &amp; Règlement: Les Entrepreneurs s'engagent à verser 2% sur chaque paiement d'élève validé (mode En Ligne et Présentiel). Ce versement s'effectuera en une seule fois (versement unique) à la fin de la campagne annuelle de préparation (courant octobre), après arrêté du bilan des inscriptions et calcul du montant global.</w:t>
-      </w:r>
-    </w:p>
-    <w:p>
-      <w:r>
-        <w:t>• Coûts de fonctionnement : En cas de dépassement des quotas d'hébergement gratuits (Vercel, Supabase, Cloudflare), les Entrepreneurs financent les abonnements. Pour minimiser l'impact, le Concepteur s'engage à n'activer les options payantes que sur la période active de juillet à octobre (2 à 3 mois). Le Concepteur effectue les intégrations techniques à titre gratuit.</w:t>
-      </w:r>
-    </w:p>
-    <w:p>
-      <w:r/>
-    </w:p>
-    <w:p>
-      <w:r/>
-      <w:r>
-        <w:rPr>
-          <w:b/>
-        </w:rPr>
-        <w:t>Article 3 : Gestion des Évolutions de la Plateforme</w:t>
-      </w:r>
-      <w:r/>
-    </w:p>
-    <w:p>
-      <w:r>
-        <w:t>Les corrections de bugs et modifications mineures sont incluses. Pour toute nouvelle fonctionnalité, les Entrepreneurs formuleront une demande écrite. Le Concepteur fournira une étude écrite détaillant avantages, inconvénients, et tarification. Si les Entrepreneurs refusent la facturation au forfait, les deux parties négocieront une hausse du pourcentage de commission de la plateforme.</w:t>
-      </w:r>
-    </w:p>
-    <w:p>
-      <w:r/>
-    </w:p>
-    <w:p>
-      <w:r/>
-      <w:r>
-        <w:rPr>
-          <w:b/>
-        </w:rPr>
-        <w:t>Article 4 : Durée d'Engagement &amp; Exclusivité (5 Ans)</w:t>
-      </w:r>
-      <w:r/>
-    </w:p>
-    <w:p>
-      <w:r>
-        <w:t>Le contrat est conclu pour une durée ferme de cinq (5) ans. Les Entrepreneurs s'engagent à utiliser exclusivement la solution du Concepteur durant toute cette période pour leur activité de préparation.</w:t>
-      </w:r>
-    </w:p>
-    <w:p>
-      <w:r/>
-    </w:p>
-    <w:p>
-      <w:r/>
-      <w:r>
-        <w:rPr>
-          <w:b/>
-        </w:rPr>
-        <w:t>Article 5 : Résiliation Anticipée &amp; Clause de Pénalité (5%)</w:t>
-      </w:r>
-      <w:r/>
-    </w:p>
-    <w:p>
-      <w:r>
-        <w:t>En cas de rupture anticipée du contrat par les Entrepreneurs, ou s'ils choisissent d'exploiter un autre outil logiciel (développé en interne ou par un tiers) avant la fin de l'engagement de 5 ans, les Entrepreneurs s'engagent solidairement à payer au Concepteur une indemnité réparatrice mensuelle de 5% du montant de chaque inscription validée sur la plateforme concurrente, et ce jusqu'au terme de l'engagement de 5 ans.</w:t>
-      </w:r>
-    </w:p>
-    <w:p>
-      <w:r/>
-    </w:p>
-    <w:p>
-      <w:r/>
-      <w:r>
-        <w:rPr>
-          <w:b/>
-        </w:rPr>
-        <w:t>Article 6 : Propriété Intellectuelle</w:t>
-      </w:r>
-      <w:r/>
-    </w:p>
-    <w:p>
-      <w:r>
-        <w:t>Le code source, le design graphique et les bases de données demeurent la propriété exclusive et inaliénable du Concepteur. Les supports de cours et les données privées des élèves restent la propriété des Entrepreneurs.</w:t>
-      </w:r>
-    </w:p>
-    <w:p>
-      <w:r/>
-    </w:p>
-    <w:p>
-      <w:r/>
-      <w:r>
-        <w:rPr>
-          <w:b/>
-        </w:rPr>
-        <w:t>Article 7 : SLA &amp; Limitation de Responsabilité</w:t>
-      </w:r>
-      <w:r/>
-    </w:p>
-    <w:p>
-      <w:r>
-        <w:t>• Assistance technique (SLA) : En cas de dysfonctionnement critique, le Concepteur s'engage à intervenir sous 4 heures ouvrables (8h - 20h) pendant la période de juillet à octobre. Les interventions nocturnes ne sont pas garanties.</w:t>
-      </w:r>
-    </w:p>
-    <w:p>
-      <w:r>
-        <w:t>• Plafond de Responsabilité : La responsabilité financière totale du Concepteur pour tout dommage lié à l'utilisation ou l'indisponibilité de la plateforme est expressément plafonnée aux sommes perçues par le Concepteur en exécution du présent contrat sur la campagne annuelle concernée.</w:t>
-      </w:r>
-    </w:p>
-    <w:p>
-      <w:r/>
-    </w:p>
-    <w:p>
-      <w:r/>
-    </w:p>
-    <w:p>
-      <w:r>
-        <w:t>Fait à [Ville], le [Date]</w:t>
-      </w:r>
-    </w:p>
-    <w:p>
-      <w:r/>
-    </w:p>
-    <w:p>
-      <w:r/>
-    </w:p>
-    <w:p>
-      <w:r/>
-    </w:p>
-    <w:p>
-      <w:r>
-        <w:t>Pour Le Concepteur :</w:t>
-      </w:r>
-    </w:p>
-    <w:p>
-      <w:r>
-        <w:t>M. Sidoine K.</w:t>
-      </w:r>
-    </w:p>
-    <w:p>
-      <w:r>
-        <w:t>(Signature et mention "Lu et approuvé")</w:t>
-      </w:r>
-    </w:p>
-    <w:p>
-      <w:r/>
-    </w:p>
-    <w:p>
-      <w:r/>
-    </w:p>
-    <w:p>
-      <w:r/>
-    </w:p>
-    <w:p>
-      <w:r>
-        <w:t>Pour Les Entrepreneurs d'OGE Académie (Co-Signataires obligatoires) :</w:t>
-      </w:r>
-    </w:p>
-    <w:p>
-      <w:r/>
-    </w:p>
-    <w:p>
-      <w:r/>
-    </w:p>
-    <w:p>
-      <w:r/>
-    </w:p>
-    <w:tbl>
-      <w:tblPr>
-        <w:tblStyle w:val="TableGrid"/>
-        <w:tblW w:type="auto" w:w="0"/>
-        <w:tblLook w:firstColumn="1" w:firstRow="1" w:lastColumn="0" w:lastRow="0" w:noHBand="0" w:noVBand="1" w:val="04A0"/>
-      </w:tblPr>
-      <w:tblGrid>
-        <w:gridCol w:w="4680"/>
-        <w:gridCol w:w="4680"/>
-      </w:tblGrid>
-      <w:tr>
-        <w:trPr>
-          <w:cantSplit/>
-          <w:tblHeader/>
-        </w:trPr>
-        <w:tc>
-          <w:tcPr>
-            <w:tcW w:type="dxa" w:w="4680"/>
-            <w:tcMar>
-              <w:top w:w="140" w:type="dxa"/>
-              <w:bottom w:w="140" w:type="dxa"/>
-              <w:left w:w="180" w:type="dxa"/>
-              <w:right w:w="180" w:type="dxa"/>
-            </w:tcMar>
-            <w:shd w:fill="1A5276"/>
-          </w:tcPr>
-          <w:p>
-            <w:pPr>
-              <w:jc w:val="center"/>
-            </w:pPr>
-            <w:r>
-              <w:rPr>
-                <w:b/>
-                <w:color w:val="FFFFFF"/>
-              </w:rPr>
-              <w:t>Le Premier Entrepreneur / Co-Fondateur : M. / Mme [Nom de l'Entrepreneur 1]   (Signature et mention "Lu et approuvé")</w:t>
-            </w:r>
-          </w:p>
-        </w:tc>
-        <w:tc>
-          <w:tcPr>
-            <w:tcW w:type="dxa" w:w="4680"/>
-            <w:tcMar>
-              <w:top w:w="140" w:type="dxa"/>
-              <w:bottom w:w="140" w:type="dxa"/>
-              <w:left w:w="180" w:type="dxa"/>
-              <w:right w:w="180" w:type="dxa"/>
-            </w:tcMar>
-            <w:shd w:fill="1A5276"/>
-          </w:tcPr>
-          <w:p>
-            <w:pPr>
-              <w:jc w:val="center"/>
-            </w:pPr>
-            <w:r>
-              <w:rPr>
-                <w:b/>
-                <w:color w:val="FFFFFF"/>
-              </w:rPr>
-              <w:t>Le Deuxième Entrepreneur / Co-Fondateur : M. / Mme [Nom de l'Entrepreneur 2]   (Signature et mention "Lu et approuvé")</w:t>
+              <w:t>M. / Mme [Nom de l'Entrepreneur 2]</w:t>
             </w:r>
           </w:p>
         </w:tc>
@@ -897,9 +1352,7 @@
             <w:pPr>
               <w:jc w:val="left"/>
             </w:pPr>
-            <w:r>
-              <w:t>---</w:t>
-            </w:r>
+            <w:r/>
           </w:p>
         </w:tc>
         <w:tc>
@@ -917,7 +1370,7 @@
               <w:jc w:val="left"/>
             </w:pPr>
             <w:r>
-              <w:t>---</w:t>
+              <w:t>(Signature et mention "Lu et approuvé")</w:t>
             </w:r>
           </w:p>
         </w:tc>
@@ -1303,7 +1756,7 @@
     <w:rsid w:val="00FC693F"/>
     <w:rPr>
       <w:rFonts w:ascii="Calibri" w:hAnsi="Calibri"/>
-      <w:color w:val="212529"/>
+      <w:color w:val="000000"/>
       <w:sz w:val="22"/>
     </w:rPr>
   </w:style>

</xml_diff>

<commit_message>
feat(analytics): install tracking system, stats API, page duration, and live feed dashboard with shadcn design
</commit_message>
<xml_diff>
--- a/.skills/ChefsOge/proposition_commerciale_oge.docx
+++ b/.skills/ChefsOge/proposition_commerciale_oge.docx
@@ -3,8 +3,512 @@
 <w:document xmlns:wpc="http://schemas.microsoft.com/office/word/2010/wordprocessingCanvas" xmlns:mo="http://schemas.microsoft.com/office/mac/office/2008/main" xmlns:mc="http://schemas.openxmlformats.org/markup-compatibility/2006" xmlns:mv="urn:schemas-microsoft-com:mac:vml" xmlns:o="urn:schemas-microsoft-com:office:office" xmlns:r="http://schemas.openxmlformats.org/officeDocument/2006/relationships" xmlns:m="http://schemas.openxmlformats.org/officeDocument/2006/math" xmlns:v="urn:schemas-microsoft-com:vml" xmlns:wp14="http://schemas.microsoft.com/office/word/2010/wordprocessingDrawing" xmlns:wp="http://schemas.openxmlformats.org/drawingml/2006/wordprocessingDrawing" xmlns:w10="urn:schemas-microsoft-com:office:word" xmlns:w="http://schemas.openxmlformats.org/wordprocessingml/2006/main" xmlns:w14="http://schemas.microsoft.com/office/word/2010/wordml" xmlns:wpg="http://schemas.microsoft.com/office/word/2010/wordprocessingGroup" xmlns:wpi="http://schemas.microsoft.com/office/word/2010/wordprocessingInk" xmlns:wne="http://schemas.microsoft.com/office/word/2006/wordml" xmlns:wps="http://schemas.microsoft.com/office/word/2010/wordprocessingShape" mc:Ignorable="w14 wp14">
   <w:body>
     <w:p>
+      <w:r/>
+      <w:r>
+        <w:rPr>
+          <w:b/>
+        </w:rPr>
+        <w:t>OGE ACADÉMIE</w:t>
+      </w:r>
+      <w:r/>
+    </w:p>
+    <w:p>
+      <w:r>
+        <w:t>Plateforme SaaS de Préparation aux Concours d'Élite</w:t>
+      </w:r>
+    </w:p>
+    <w:p>
+      <w:r>
+        <w:t>INP-HB  •  ESATIC  •  CME</w:t>
+      </w:r>
+    </w:p>
+    <w:p>
+      <w:r/>
+      <w:r>
+        <w:rPr>
+          <w:b/>
+        </w:rPr>
+        <w:t>CONTRAT DE PARTENARIAT TECHNIQUE &amp; COMMERCIAL</w:t>
+      </w:r>
+      <w:r/>
+    </w:p>
+    <w:p>
+      <w:r/>
+    </w:p>
+    <w:p>
+      <w:r>
+        <w:t>---</w:t>
+      </w:r>
+    </w:p>
+    <w:p>
+      <w:r/>
+    </w:p>
+    <w:tbl>
+      <w:tblPr>
+        <w:tblStyle w:val="TableGrid"/>
+        <w:tblW w:type="auto" w:w="0"/>
+        <w:tblLook w:firstColumn="1" w:firstRow="1" w:lastColumn="0" w:lastRow="0" w:noHBand="0" w:noVBand="1" w:val="04A0"/>
+      </w:tblPr>
+      <w:tblGrid>
+        <w:gridCol w:w="2340"/>
+        <w:gridCol w:w="2340"/>
+        <w:gridCol w:w="2340"/>
+        <w:gridCol w:w="2340"/>
+      </w:tblGrid>
+      <w:tr>
+        <w:trPr>
+          <w:cantSplit/>
+          <w:tblHeader/>
+        </w:trPr>
+        <w:tc>
+          <w:tcPr>
+            <w:tcW w:type="dxa" w:w="2340"/>
+            <w:tcMar>
+              <w:top w:w="140" w:type="dxa"/>
+              <w:bottom w:w="140" w:type="dxa"/>
+              <w:left w:w="180" w:type="dxa"/>
+              <w:right w:w="180" w:type="dxa"/>
+            </w:tcMar>
+            <w:shd w:fill="FF7900"/>
+          </w:tcPr>
+          <w:p>
+            <w:pPr>
+              <w:jc w:val="center"/>
+            </w:pPr>
+            <w:r>
+              <w:rPr>
+                <w:b/>
+                <w:color w:val="FFFFFF"/>
+              </w:rPr>
+              <w:t>Parties</w:t>
+            </w:r>
+          </w:p>
+        </w:tc>
+        <w:tc>
+          <w:tcPr>
+            <w:tcW w:type="dxa" w:w="2340"/>
+            <w:tcMar>
+              <w:top w:w="140" w:type="dxa"/>
+              <w:bottom w:w="140" w:type="dxa"/>
+              <w:left w:w="180" w:type="dxa"/>
+              <w:right w:w="180" w:type="dxa"/>
+            </w:tcMar>
+            <w:shd w:fill="FF7900"/>
+          </w:tcPr>
+          <w:p>
+            <w:pPr>
+              <w:jc w:val="center"/>
+            </w:pPr>
+            <w:r>
+              <w:rPr>
+                <w:b/>
+                <w:color w:val="FFFFFF"/>
+              </w:rPr>
+              <w:t>Concepteur</w:t>
+            </w:r>
+          </w:p>
+        </w:tc>
+        <w:tc>
+          <w:tcPr>
+            <w:tcW w:type="dxa" w:w="2340"/>
+            <w:tcMar>
+              <w:top w:w="140" w:type="dxa"/>
+              <w:bottom w:w="140" w:type="dxa"/>
+              <w:left w:w="180" w:type="dxa"/>
+              <w:right w:w="180" w:type="dxa"/>
+            </w:tcMar>
+            <w:shd w:fill="FF7900"/>
+          </w:tcPr>
+          <w:p>
+            <w:pPr>
+              <w:jc w:val="center"/>
+            </w:pPr>
+            <w:r>
+              <w:rPr>
+                <w:b/>
+                <w:color w:val="FFFFFF"/>
+              </w:rPr>
+              <w:t>Entrepreneurs</w:t>
+            </w:r>
+          </w:p>
+        </w:tc>
+        <w:tc>
+          <w:tcPr>
+            <w:tcW w:type="dxa" w:w="2340"/>
+            <w:tcMar>
+              <w:top w:w="140" w:type="dxa"/>
+              <w:bottom w:w="140" w:type="dxa"/>
+              <w:left w:w="180" w:type="dxa"/>
+              <w:right w:w="180" w:type="dxa"/>
+            </w:tcMar>
+            <w:shd w:fill="FF7900"/>
+          </w:tcPr>
+          <w:p>
+            <w:pPr>
+              <w:jc w:val="center"/>
+            </w:pPr>
+            <w:r>
+              <w:rPr>
+                <w:b/>
+                <w:color w:val="FFFFFF"/>
+              </w:rPr>
+              <w:t>Durée</w:t>
+            </w:r>
+          </w:p>
+        </w:tc>
+      </w:tr>
+      <w:tr>
+        <w:trPr>
+          <w:cantSplit/>
+        </w:trPr>
+        <w:tc>
+          <w:tcPr>
+            <w:tcW w:type="dxa" w:w="2340"/>
+            <w:tcMar>
+              <w:top w:w="140" w:type="dxa"/>
+              <w:bottom w:w="140" w:type="dxa"/>
+              <w:left w:w="180" w:type="dxa"/>
+              <w:right w:w="180" w:type="dxa"/>
+            </w:tcMar>
+          </w:tcPr>
+          <w:p>
+            <w:pPr>
+              <w:jc w:val="left"/>
+            </w:pPr>
+            <w:r>
+              <w:t>---</w:t>
+            </w:r>
+          </w:p>
+        </w:tc>
+        <w:tc>
+          <w:tcPr>
+            <w:tcW w:type="dxa" w:w="2340"/>
+            <w:tcMar>
+              <w:top w:w="140" w:type="dxa"/>
+              <w:bottom w:w="140" w:type="dxa"/>
+              <w:left w:w="180" w:type="dxa"/>
+              <w:right w:w="180" w:type="dxa"/>
+            </w:tcMar>
+          </w:tcPr>
+          <w:p>
+            <w:pPr>
+              <w:jc w:val="left"/>
+            </w:pPr>
+            <w:r>
+              <w:t>---</w:t>
+            </w:r>
+          </w:p>
+        </w:tc>
+        <w:tc>
+          <w:tcPr>
+            <w:tcW w:type="dxa" w:w="2340"/>
+            <w:tcMar>
+              <w:top w:w="140" w:type="dxa"/>
+              <w:bottom w:w="140" w:type="dxa"/>
+              <w:left w:w="180" w:type="dxa"/>
+              <w:right w:w="180" w:type="dxa"/>
+            </w:tcMar>
+          </w:tcPr>
+          <w:p>
+            <w:pPr>
+              <w:jc w:val="left"/>
+            </w:pPr>
+            <w:r>
+              <w:t>---</w:t>
+            </w:r>
+          </w:p>
+        </w:tc>
+        <w:tc>
+          <w:tcPr>
+            <w:tcW w:type="dxa" w:w="2340"/>
+            <w:tcMar>
+              <w:top w:w="140" w:type="dxa"/>
+              <w:bottom w:w="140" w:type="dxa"/>
+              <w:left w:w="180" w:type="dxa"/>
+              <w:right w:w="180" w:type="dxa"/>
+            </w:tcMar>
+          </w:tcPr>
+          <w:p>
+            <w:pPr>
+              <w:jc w:val="left"/>
+            </w:pPr>
+            <w:r>
+              <w:t>---</w:t>
+            </w:r>
+          </w:p>
+        </w:tc>
+      </w:tr>
+      <w:tr>
+        <w:trPr>
+          <w:cantSplit/>
+        </w:trPr>
+        <w:tc>
+          <w:tcPr>
+            <w:tcW w:type="dxa" w:w="2340"/>
+            <w:tcMar>
+              <w:top w:w="140" w:type="dxa"/>
+              <w:bottom w:w="140" w:type="dxa"/>
+              <w:left w:w="180" w:type="dxa"/>
+              <w:right w:w="180" w:type="dxa"/>
+            </w:tcMar>
+            <w:shd w:fill="F2F4F4"/>
+          </w:tcPr>
+          <w:p>
+            <w:pPr>
+              <w:jc w:val="left"/>
+            </w:pPr>
+            <w:r>
+              <w:t>Accord</w:t>
+            </w:r>
+          </w:p>
+        </w:tc>
+        <w:tc>
+          <w:tcPr>
+            <w:tcW w:type="dxa" w:w="2340"/>
+            <w:tcMar>
+              <w:top w:w="140" w:type="dxa"/>
+              <w:bottom w:w="140" w:type="dxa"/>
+              <w:left w:w="180" w:type="dxa"/>
+              <w:right w:w="180" w:type="dxa"/>
+            </w:tcMar>
+            <w:shd w:fill="F2F4F4"/>
+          </w:tcPr>
+          <w:p>
+            <w:pPr>
+              <w:jc w:val="left"/>
+            </w:pPr>
+            <w:r>
+              <w:t>M. Sidoine K.</w:t>
+            </w:r>
+          </w:p>
+        </w:tc>
+        <w:tc>
+          <w:tcPr>
+            <w:tcW w:type="dxa" w:w="2340"/>
+            <w:tcMar>
+              <w:top w:w="140" w:type="dxa"/>
+              <w:bottom w:w="140" w:type="dxa"/>
+              <w:left w:w="180" w:type="dxa"/>
+              <w:right w:w="180" w:type="dxa"/>
+            </w:tcMar>
+            <w:shd w:fill="F2F4F4"/>
+          </w:tcPr>
+          <w:p>
+            <w:pPr>
+              <w:jc w:val="left"/>
+            </w:pPr>
+            <w:r>
+              <w:t>[Entrepreneur 1] &amp; [Entrepreneur 2]</w:t>
+            </w:r>
+          </w:p>
+        </w:tc>
+        <w:tc>
+          <w:tcPr>
+            <w:tcW w:type="dxa" w:w="2340"/>
+            <w:tcMar>
+              <w:top w:w="140" w:type="dxa"/>
+              <w:bottom w:w="140" w:type="dxa"/>
+              <w:left w:w="180" w:type="dxa"/>
+              <w:right w:w="180" w:type="dxa"/>
+            </w:tcMar>
+            <w:shd w:fill="F2F4F4"/>
+          </w:tcPr>
+          <w:p>
+            <w:pPr>
+              <w:jc w:val="left"/>
+            </w:pPr>
+            <w:r>
+              <w:t>10 ans ferme</w:t>
+            </w:r>
+          </w:p>
+        </w:tc>
+      </w:tr>
+      <w:tr>
+        <w:trPr>
+          <w:cantSplit/>
+        </w:trPr>
+        <w:tc>
+          <w:tcPr>
+            <w:tcW w:type="dxa" w:w="2340"/>
+            <w:tcMar>
+              <w:top w:w="140" w:type="dxa"/>
+              <w:bottom w:w="140" w:type="dxa"/>
+              <w:left w:w="180" w:type="dxa"/>
+              <w:right w:w="180" w:type="dxa"/>
+            </w:tcMar>
+          </w:tcPr>
+          <w:p>
+            <w:pPr>
+              <w:jc w:val="left"/>
+            </w:pPr>
+            <w:r>
+              <w:t>Commission</w:t>
+            </w:r>
+          </w:p>
+        </w:tc>
+        <w:tc>
+          <w:tcPr>
+            <w:tcW w:type="dxa" w:w="2340"/>
+            <w:tcMar>
+              <w:top w:w="140" w:type="dxa"/>
+              <w:bottom w:w="140" w:type="dxa"/>
+              <w:left w:w="180" w:type="dxa"/>
+              <w:right w:w="180" w:type="dxa"/>
+            </w:tcMar>
+          </w:tcPr>
+          <w:p>
+            <w:pPr>
+              <w:jc w:val="left"/>
+            </w:pPr>
+            <w:r>
+              <w:t>Frais initiaux</w:t>
+            </w:r>
+          </w:p>
+        </w:tc>
+        <w:tc>
+          <w:tcPr>
+            <w:tcW w:type="dxa" w:w="2340"/>
+            <w:tcMar>
+              <w:top w:w="140" w:type="dxa"/>
+              <w:bottom w:w="140" w:type="dxa"/>
+              <w:left w:w="180" w:type="dxa"/>
+              <w:right w:w="180" w:type="dxa"/>
+            </w:tcMar>
+          </w:tcPr>
+          <w:p>
+            <w:pPr>
+              <w:jc w:val="left"/>
+            </w:pPr>
+            <w:r>
+              <w:t>SLA (critique)</w:t>
+            </w:r>
+          </w:p>
+        </w:tc>
+        <w:tc>
+          <w:tcPr>
+            <w:tcW w:type="dxa" w:w="2340"/>
+            <w:tcMar>
+              <w:top w:w="140" w:type="dxa"/>
+              <w:bottom w:w="140" w:type="dxa"/>
+              <w:left w:w="180" w:type="dxa"/>
+              <w:right w:w="180" w:type="dxa"/>
+            </w:tcMar>
+          </w:tcPr>
+          <w:p>
+            <w:pPr>
+              <w:jc w:val="left"/>
+            </w:pPr>
+            <w:r>
+              <w:t>Ville</w:t>
+            </w:r>
+          </w:p>
+        </w:tc>
+      </w:tr>
+      <w:tr>
+        <w:trPr>
+          <w:cantSplit/>
+        </w:trPr>
+        <w:tc>
+          <w:tcPr>
+            <w:tcW w:type="dxa" w:w="2340"/>
+            <w:tcMar>
+              <w:top w:w="140" w:type="dxa"/>
+              <w:bottom w:w="140" w:type="dxa"/>
+              <w:left w:w="180" w:type="dxa"/>
+              <w:right w:w="180" w:type="dxa"/>
+            </w:tcMar>
+            <w:shd w:fill="F2F4F4"/>
+          </w:tcPr>
+          <w:p>
+            <w:pPr>
+              <w:jc w:val="left"/>
+            </w:pPr>
+            <w:r>
+              <w:t>2 % / transaction</w:t>
+            </w:r>
+          </w:p>
+        </w:tc>
+        <w:tc>
+          <w:tcPr>
+            <w:tcW w:type="dxa" w:w="2340"/>
+            <w:tcMar>
+              <w:top w:w="140" w:type="dxa"/>
+              <w:bottom w:w="140" w:type="dxa"/>
+              <w:left w:w="180" w:type="dxa"/>
+              <w:right w:w="180" w:type="dxa"/>
+            </w:tcMar>
+            <w:shd w:fill="F2F4F4"/>
+          </w:tcPr>
+          <w:p>
+            <w:pPr>
+              <w:jc w:val="left"/>
+            </w:pPr>
+            <w:r>
+              <w:t>0 FCFA</w:t>
+            </w:r>
+          </w:p>
+        </w:tc>
+        <w:tc>
+          <w:tcPr>
+            <w:tcW w:type="dxa" w:w="2340"/>
+            <w:tcMar>
+              <w:top w:w="140" w:type="dxa"/>
+              <w:bottom w:w="140" w:type="dxa"/>
+              <w:left w:w="180" w:type="dxa"/>
+              <w:right w:w="180" w:type="dxa"/>
+            </w:tcMar>
+            <w:shd w:fill="F2F4F4"/>
+          </w:tcPr>
+          <w:p>
+            <w:pPr>
+              <w:jc w:val="left"/>
+            </w:pPr>
+            <w:r>
+              <w:t>&lt; 4h ouvrables</w:t>
+            </w:r>
+          </w:p>
+        </w:tc>
+        <w:tc>
+          <w:tcPr>
+            <w:tcW w:type="dxa" w:w="2340"/>
+            <w:tcMar>
+              <w:top w:w="140" w:type="dxa"/>
+              <w:bottom w:w="140" w:type="dxa"/>
+              <w:left w:w="180" w:type="dxa"/>
+              <w:right w:w="180" w:type="dxa"/>
+            </w:tcMar>
+            <w:shd w:fill="F2F4F4"/>
+          </w:tcPr>
+          <w:p>
+            <w:pPr>
+              <w:jc w:val="left"/>
+            </w:pPr>
+            <w:r>
+              <w:t>Abidjan / Yamoussoukro</w:t>
+            </w:r>
+          </w:p>
+        </w:tc>
+      </w:tr>
+    </w:tbl>
+    <w:p>
       <w:pPr>
-        <w:pStyle w:val="Heading1"/>
+        <w:spacing w:before="120"/>
+      </w:pPr>
+    </w:p>
+    <w:p>
+      <w:r/>
+    </w:p>
+    <w:p>
+      <w:r>
+        <w:t>---</w:t>
+      </w:r>
+    </w:p>
+    <w:p>
+      <w:r/>
+    </w:p>
+    <w:p>
+      <w:pPr>
+        <w:pStyle w:val="Heading2"/>
         <w:keepNext/>
         <w:spacing w:before="240" w:after="120"/>
       </w:pPr>
@@ -13,9 +517,25 @@
           <w:rFonts w:ascii="Calibri Light" w:hAnsi="Calibri Light"/>
           <w:b/>
           <w:color w:val="000000"/>
-          <w:sz w:val="40"/>
+          <w:sz w:val="32"/>
         </w:rPr>
-        <w:t>OGE ACADÉMIE — PARTENARIAT TECHNIQUE &amp; COMMERCIAL</w:t>
+        <w:t>Préambule</w:t>
+      </w:r>
+    </w:p>
+    <w:p>
+      <w:r/>
+    </w:p>
+    <w:p>
+      <w:r>
+        <w:t>Le présent contrat formalise le partenariat entre M. Sidoine K. (ci-après « le Concepteur ») et les deux co-fondateurs d'OGE Académie (ci-après « les Entrepreneurs »). Il définit les conditions de mise à disposition, d'exploitation et de maintenance de la plateforme numérique OGE Académie, solution SaaS dédiée à la préparation des candidats aux concours d'entrée de l'INP-HB, l'ESATIC et le CME en Côte d'Ivoire.</w:t>
+      </w:r>
+    </w:p>
+    <w:p>
+      <w:r/>
+    </w:p>
+    <w:p>
+      <w:r>
+        <w:t>---</w:t>
       </w:r>
     </w:p>
     <w:p>
@@ -23,7 +543,7 @@
     </w:p>
     <w:p>
       <w:pPr>
-        <w:pStyle w:val="Heading1"/>
+        <w:pStyle w:val="Heading2"/>
         <w:keepNext/>
         <w:spacing w:before="240" w:after="120"/>
       </w:pPr>
@@ -32,14 +552,76 @@
           <w:rFonts w:ascii="Calibri Light" w:hAnsi="Calibri Light"/>
           <w:b/>
           <w:color w:val="000000"/>
-          <w:sz w:val="40"/>
+          <w:sz w:val="32"/>
         </w:rPr>
-        <w:t>PROPOSITION COMMERCIALE &amp; CONTRAT DE PARTENARIAT</w:t>
+        <w:t>Article 1 — Objet du Contrat</w:t>
       </w:r>
     </w:p>
     <w:p>
+      <w:r/>
+    </w:p>
+    <w:p>
       <w:r>
-        <w:t>*Plateforme SaaS de Préparation de Concours – OGE Académie*</w:t>
+        <w:t>Le Concepteur s'engage à mettre à disposition des Entrepreneurs, à titre exclusif, la plateforme web OGE Académie, comprenant l'ensemble des fonctionnalités suivantes :</w:t>
+      </w:r>
+    </w:p>
+    <w:p>
+      <w:r/>
+    </w:p>
+    <w:p>
+      <w:pPr>
+        <w:pStyle w:val="ListBullet"/>
+      </w:pPr>
+      <w:r>
+        <w:t>Inscription en ligne des candidats, organisée par zone géographique (6 zones : Abidjan, Yamoussoukro et 4 autres zones) et par mode de préparation (présentiel / en ligne).</w:t>
+      </w:r>
+    </w:p>
+    <w:p>
+      <w:pPr>
+        <w:pStyle w:val="ListBullet"/>
+      </w:pPr>
+      <w:r>
+        <w:t>Gestion des paiements par validation manuelle des reçus Wave uploadés par les candidats.</w:t>
+      </w:r>
+    </w:p>
+    <w:p>
+      <w:pPr>
+        <w:pStyle w:val="ListBullet"/>
+      </w:pPr>
+      <w:r>
+        <w:t>Affichage sécurisé des supports de cours PDF (sans possibilité de téléchargement ni de copie) et accès aux liens de sessions Google Meet.</w:t>
+      </w:r>
+    </w:p>
+    <w:p>
+      <w:pPr>
+        <w:pStyle w:val="ListBullet"/>
+      </w:pPr>
+      <w:r>
+        <w:t>Dashboard candidat : suivi des cours, accès aux documents, statut du compte.</w:t>
+      </w:r>
+    </w:p>
+    <w:p>
+      <w:pPr>
+        <w:pStyle w:val="ListBullet"/>
+      </w:pPr>
+      <w:r>
+        <w:t>Dashboard responsable de zone : gestion des candidats de sa zone, vérification des justificatifs de paiement, activation des comptes.</w:t>
+      </w:r>
+    </w:p>
+    <w:p>
+      <w:pPr>
+        <w:pStyle w:val="ListBullet"/>
+      </w:pPr>
+      <w:r>
+        <w:t>Dashboard administrateur (2 comptes) : gestion complète des managers, des admins et des candidats — ajout, modification, suppression. Gestion des médias (photos, vidéos). CMS de la page d'accueil (textes, coordonnées, tarifs) sans intervention d'un développeur.</w:t>
+      </w:r>
+    </w:p>
+    <w:p>
+      <w:pPr>
+        <w:pStyle w:val="ListBullet"/>
+      </w:pPr>
+      <w:r>
+        <w:t>Compte Super Administrateur unique : accès global à toutes les fonctionnalités de la plateforme.</w:t>
       </w:r>
     </w:p>
     <w:p>
@@ -48,6 +630,751 @@
     <w:p>
       <w:r>
         <w:t>---</w:t>
+      </w:r>
+    </w:p>
+    <w:p>
+      <w:r/>
+    </w:p>
+    <w:p>
+      <w:pPr>
+        <w:pStyle w:val="Heading2"/>
+        <w:keepNext/>
+        <w:spacing w:before="240" w:after="120"/>
+      </w:pPr>
+      <w:r>
+        <w:rPr>
+          <w:rFonts w:ascii="Calibri Light" w:hAnsi="Calibri Light"/>
+          <w:b/>
+          <w:color w:val="000000"/>
+          <w:sz w:val="32"/>
+        </w:rPr>
+        <w:t>Article 2 — Conditions Financières</w:t>
+      </w:r>
+    </w:p>
+    <w:p>
+      <w:r/>
+    </w:p>
+    <w:p>
+      <w:pPr>
+        <w:pStyle w:val="Heading3"/>
+        <w:keepNext/>
+        <w:spacing w:before="240" w:after="120"/>
+      </w:pPr>
+      <w:r>
+        <w:rPr>
+          <w:rFonts w:ascii="Calibri Light" w:hAnsi="Calibri Light"/>
+          <w:b/>
+          <w:color w:val="000000"/>
+          <w:sz w:val="26"/>
+        </w:rPr>
+        <w:t>2.1 — Frais d'installation</w:t>
+      </w:r>
+    </w:p>
+    <w:p>
+      <w:r/>
+    </w:p>
+    <w:p>
+      <w:r>
+        <w:t>Aucun frais d'installation ni de mise en route n'est facturé aux Entrepreneurs. La mise à disposition initiale de la plateforme est gratuite (0 FCFA).</w:t>
+      </w:r>
+    </w:p>
+    <w:p>
+      <w:r/>
+    </w:p>
+    <w:p>
+      <w:pPr>
+        <w:pStyle w:val="Heading3"/>
+        <w:keepNext/>
+        <w:spacing w:before="240" w:after="120"/>
+      </w:pPr>
+      <w:r>
+        <w:rPr>
+          <w:rFonts w:ascii="Calibri Light" w:hAnsi="Calibri Light"/>
+          <w:b/>
+          <w:color w:val="000000"/>
+          <w:sz w:val="26"/>
+        </w:rPr>
+        <w:t>2.2 — Commission récurrente</w:t>
+      </w:r>
+    </w:p>
+    <w:p>
+      <w:r/>
+    </w:p>
+    <w:p>
+      <w:r>
+        <w:t xml:space="preserve">En contrepartie de la mise à disposition et de la maintenance de la plateforme, les Entrepreneurs versent au Concepteur une commission de </w:t>
+      </w:r>
+      <w:r>
+        <w:rPr>
+          <w:b/>
+        </w:rPr>
+        <w:t>deux pour cent (2 %)</w:t>
+      </w:r>
+      <w:r>
+        <w:t xml:space="preserve"> sur le montant total de chaque transaction validée sur la plateforme, qu'il s'agisse d'inscriptions en ligne ou en présentiel.</w:t>
+      </w:r>
+    </w:p>
+    <w:p>
+      <w:r/>
+    </w:p>
+    <w:p>
+      <w:r>
+        <w:t>Le règlement s'effectue en un versement unique, à la fin de la campagne annuelle de préparation (courant octobre).</w:t>
+      </w:r>
+    </w:p>
+    <w:p>
+      <w:r/>
+    </w:p>
+    <w:p>
+      <w:pPr>
+        <w:pStyle w:val="Heading3"/>
+        <w:keepNext/>
+        <w:spacing w:before="240" w:after="120"/>
+      </w:pPr>
+      <w:r>
+        <w:rPr>
+          <w:rFonts w:ascii="Calibri Light" w:hAnsi="Calibri Light"/>
+          <w:b/>
+          <w:color w:val="000000"/>
+          <w:sz w:val="26"/>
+        </w:rPr>
+        <w:t>2.3 — Frais d'infrastructure et d'hébergement</w:t>
+      </w:r>
+    </w:p>
+    <w:p>
+      <w:r/>
+    </w:p>
+    <w:p>
+      <w:r>
+        <w:t>L'architecture technique de la plateforme est conçue pour maximiser l'usage des offres gratuites (Vercel, Supabase, Cloudflare R2). En cas de dépassement des quotas gratuits, les règles suivantes s'appliquent :</w:t>
+      </w:r>
+    </w:p>
+    <w:p>
+      <w:r/>
+    </w:p>
+    <w:p>
+      <w:pPr>
+        <w:pStyle w:val="ListBullet"/>
+      </w:pPr>
+      <w:r>
+        <w:t>Les abonnements payants nécessaires (ex : Supabase Pro à 25 $/mois) sont à la charge exclusive des Entrepreneurs.</w:t>
+      </w:r>
+    </w:p>
+    <w:p>
+      <w:pPr>
+        <w:pStyle w:val="ListBullet"/>
+      </w:pPr>
+      <w:r>
+        <w:t>Le Concepteur recommande d'activer les formules payantes uniquement durant la saison active (juillet à octobre) pour optimiser les coûts, et de les suspendre hors saison.</w:t>
+      </w:r>
+    </w:p>
+    <w:p>
+      <w:pPr>
+        <w:pStyle w:val="ListBullet"/>
+      </w:pPr>
+      <w:r>
+        <w:t>Si les Entrepreneurs souhaitent maintenir un service payant actif toute l'année, ils en assument l'intégralité des coûts mensuels.</w:t>
+      </w:r>
+    </w:p>
+    <w:p>
+      <w:pPr>
+        <w:pStyle w:val="ListBullet"/>
+      </w:pPr>
+      <w:r>
+        <w:t>Le nom de domaine est pris en charge par le Concepteur, sans refacturation aux Entrepreneurs.</w:t>
+      </w:r>
+    </w:p>
+    <w:p>
+      <w:pPr>
+        <w:pStyle w:val="ListBullet"/>
+      </w:pPr>
+      <w:r>
+        <w:t>Les migrations techniques (ex : vers Cloudflare R2) sont réalisées par le Concepteur à titre gratuit.</w:t>
+      </w:r>
+    </w:p>
+    <w:p>
+      <w:r/>
+    </w:p>
+    <w:p>
+      <w:r>
+        <w:t>---</w:t>
+      </w:r>
+    </w:p>
+    <w:p>
+      <w:r/>
+    </w:p>
+    <w:p>
+      <w:pPr>
+        <w:pStyle w:val="Heading2"/>
+        <w:keepNext/>
+        <w:spacing w:before="240" w:after="120"/>
+      </w:pPr>
+      <w:r>
+        <w:rPr>
+          <w:rFonts w:ascii="Calibri Light" w:hAnsi="Calibri Light"/>
+          <w:b/>
+          <w:color w:val="000000"/>
+          <w:sz w:val="32"/>
+        </w:rPr>
+        <w:t>Article 3 — Maintenance, Support et Évolutions</w:t>
+      </w:r>
+    </w:p>
+    <w:p>
+      <w:r/>
+    </w:p>
+    <w:p>
+      <w:pPr>
+        <w:pStyle w:val="Heading3"/>
+        <w:keepNext/>
+        <w:spacing w:before="240" w:after="120"/>
+      </w:pPr>
+      <w:r>
+        <w:rPr>
+          <w:rFonts w:ascii="Calibri Light" w:hAnsi="Calibri Light"/>
+          <w:b/>
+          <w:color w:val="000000"/>
+          <w:sz w:val="26"/>
+        </w:rPr>
+        <w:t>3.1 — Maintenance incluse</w:t>
+      </w:r>
+    </w:p>
+    <w:p>
+      <w:r/>
+    </w:p>
+    <w:p>
+      <w:r>
+        <w:t>Le Concepteur assure gratuitement :</w:t>
+      </w:r>
+    </w:p>
+    <w:p>
+      <w:r/>
+    </w:p>
+    <w:p>
+      <w:pPr>
+        <w:pStyle w:val="ListBullet"/>
+      </w:pPr>
+      <w:r>
+        <w:t>La correction des anomalies bloquantes et des bugs techniques.</w:t>
+      </w:r>
+    </w:p>
+    <w:p>
+      <w:pPr>
+        <w:pStyle w:val="ListBullet"/>
+      </w:pPr>
+      <w:r>
+        <w:t>La mise à jour annuelle de l'année scolaire de référence sur la plateforme.</w:t>
+      </w:r>
+    </w:p>
+    <w:p>
+      <w:r/>
+    </w:p>
+    <w:p>
+      <w:pPr>
+        <w:pStyle w:val="Heading3"/>
+        <w:keepNext/>
+        <w:spacing w:before="240" w:after="120"/>
+      </w:pPr>
+      <w:r>
+        <w:rPr>
+          <w:rFonts w:ascii="Calibri Light" w:hAnsi="Calibri Light"/>
+          <w:b/>
+          <w:color w:val="000000"/>
+          <w:sz w:val="26"/>
+        </w:rPr>
+        <w:t>3.2 — Gestion des contenus et données (CMS)</w:t>
+      </w:r>
+    </w:p>
+    <w:p>
+      <w:r/>
+    </w:p>
+    <w:p>
+      <w:r>
+        <w:t>La plateforme intègre un CMS complet permettant aux Entrepreneurs de gérer de manière autonome : les textes de la page d'accueil, les coordonnées des centres, les tarifs, ainsi que les profils (managers, administrateurs, candidats). Cette gestion et ces mises à jour sont de la responsabilité exclusive des Entrepreneurs via leur tableau de bord. Le Concepteur n'intervient pas pour les mises à jour de contenu ; son rôle est strictement limité à la résolution des problèmes techniques.</w:t>
+      </w:r>
+    </w:p>
+    <w:p>
+      <w:r/>
+    </w:p>
+    <w:p>
+      <w:pPr>
+        <w:pStyle w:val="Heading3"/>
+        <w:keepNext/>
+        <w:spacing w:before="240" w:after="120"/>
+      </w:pPr>
+      <w:r>
+        <w:rPr>
+          <w:rFonts w:ascii="Calibri Light" w:hAnsi="Calibri Light"/>
+          <w:b/>
+          <w:color w:val="000000"/>
+          <w:sz w:val="26"/>
+        </w:rPr>
+        <w:t>3.3 — SLA (Niveau de Service)</w:t>
+      </w:r>
+    </w:p>
+    <w:p>
+      <w:r/>
+    </w:p>
+    <w:p>
+      <w:r>
+        <w:t>Durant la période active (juillet à octobre) :</w:t>
+      </w:r>
+    </w:p>
+    <w:p>
+      <w:r/>
+    </w:p>
+    <w:p>
+      <w:pPr>
+        <w:pStyle w:val="ListBullet"/>
+      </w:pPr>
+      <w:r/>
+      <w:r>
+        <w:rPr>
+          <w:b/>
+        </w:rPr>
+        <w:t>Panne critique :</w:t>
+      </w:r>
+      <w:r>
+        <w:t xml:space="preserve"> assistance technique sous 4 heures ouvrables (plage 8h00 – 20h00, jours ouvrables).</w:t>
+      </w:r>
+    </w:p>
+    <w:p>
+      <w:pPr>
+        <w:pStyle w:val="ListBullet"/>
+      </w:pPr>
+      <w:r/>
+      <w:r>
+        <w:rPr>
+          <w:b/>
+        </w:rPr>
+        <w:t>Demandes nocturnes ou non critiques :</w:t>
+      </w:r>
+      <w:r>
+        <w:t xml:space="preserve"> traitées le lendemain ouvrable.</w:t>
+      </w:r>
+    </w:p>
+    <w:p>
+      <w:pPr>
+        <w:pStyle w:val="ListBullet"/>
+      </w:pPr>
+      <w:r/>
+      <w:r>
+        <w:rPr>
+          <w:b/>
+        </w:rPr>
+        <w:t>Hors saison (novembre à juin) :</w:t>
+      </w:r>
+      <w:r>
+        <w:t xml:space="preserve"> support au mieux, sans engagement de délai.</w:t>
+      </w:r>
+    </w:p>
+    <w:p>
+      <w:r/>
+    </w:p>
+    <w:p>
+      <w:pPr>
+        <w:pStyle w:val="Heading3"/>
+        <w:keepNext/>
+        <w:spacing w:before="240" w:after="120"/>
+      </w:pPr>
+      <w:r>
+        <w:rPr>
+          <w:rFonts w:ascii="Calibri Light" w:hAnsi="Calibri Light"/>
+          <w:b/>
+          <w:color w:val="000000"/>
+          <w:sz w:val="26"/>
+        </w:rPr>
+        <w:t>3.4 — Évolutions majeures</w:t>
+      </w:r>
+    </w:p>
+    <w:p>
+      <w:r/>
+    </w:p>
+    <w:p>
+      <w:r>
+        <w:t>Toute nouvelle fonctionnalité non prévue au présent contrat fera l'objet d'un devis écrit préalable, ou d'une revalorisation de la commission mutuellement convenue (ex : passage de 2 % à 2,5 % ou 3 % selon la complexité).</w:t>
+      </w:r>
+    </w:p>
+    <w:p>
+      <w:r/>
+    </w:p>
+    <w:p>
+      <w:r>
+        <w:t>---</w:t>
+      </w:r>
+    </w:p>
+    <w:p>
+      <w:r/>
+    </w:p>
+    <w:p>
+      <w:pPr>
+        <w:pStyle w:val="Heading2"/>
+        <w:keepNext/>
+        <w:spacing w:before="240" w:after="120"/>
+      </w:pPr>
+      <w:r>
+        <w:rPr>
+          <w:rFonts w:ascii="Calibri Light" w:hAnsi="Calibri Light"/>
+          <w:b/>
+          <w:color w:val="000000"/>
+          <w:sz w:val="32"/>
+        </w:rPr>
+        <w:t>Article 4 — Durée d'Engagement &amp; Exclusivité</w:t>
+      </w:r>
+    </w:p>
+    <w:p>
+      <w:r/>
+    </w:p>
+    <w:p>
+      <w:r>
+        <w:t xml:space="preserve">Le présent contrat est conclu pour une durée ferme et irrévocable de </w:t>
+      </w:r>
+      <w:r>
+        <w:rPr>
+          <w:b/>
+        </w:rPr>
+        <w:t>dix (10) ans</w:t>
+      </w:r>
+      <w:r>
+        <w:t xml:space="preserve"> à compter de la date de signature. Durant toute cette période, les Entrepreneurs s'engagent à utiliser exclusivement la solution du Concepteur pour la gestion en ligne de leurs préparations aux concours. Le remplacement ou le contournement par toute autre solution numérique (interne ou externe) est strictement interdit durant cette période.</w:t>
+      </w:r>
+    </w:p>
+    <w:p>
+      <w:r/>
+    </w:p>
+    <w:p>
+      <w:r>
+        <w:t>---</w:t>
+      </w:r>
+    </w:p>
+    <w:p>
+      <w:r/>
+    </w:p>
+    <w:p>
+      <w:pPr>
+        <w:pStyle w:val="Heading2"/>
+        <w:keepNext/>
+        <w:spacing w:before="240" w:after="120"/>
+      </w:pPr>
+      <w:r>
+        <w:rPr>
+          <w:rFonts w:ascii="Calibri Light" w:hAnsi="Calibri Light"/>
+          <w:b/>
+          <w:color w:val="000000"/>
+          <w:sz w:val="32"/>
+        </w:rPr>
+        <w:t>Article 5 — Résiliation, Arrêt de Service &amp; Pénalités</w:t>
+      </w:r>
+    </w:p>
+    <w:p>
+      <w:r/>
+    </w:p>
+    <w:p>
+      <w:r>
+        <w:t>En cas de rupture anticipée du contrat, d'adoption d'une plateforme concurrente avant le terme des 10 ans, ou de décision des Entrepreneurs d'arrêter définitivement l'usage de plateformes en ligne ou de cours en ligne, les Entrepreneurs s'engagent solidairement à verser au Concepteur :</w:t>
+      </w:r>
+    </w:p>
+    <w:p>
+      <w:r/>
+    </w:p>
+    <w:p>
+      <w:pPr>
+        <w:pStyle w:val="ListBullet"/>
+      </w:pPr>
+      <w:r>
+        <w:t xml:space="preserve">Une pénalité forfaitaire et immédiate de </w:t>
+      </w:r>
+      <w:r>
+        <w:rPr>
+          <w:b/>
+        </w:rPr>
+        <w:t>cinq cent mille francs CFA (500 000 FCFA)</w:t>
+      </w:r>
+      <w:r>
+        <w:t xml:space="preserve"> pour rupture unilatérale.</w:t>
+      </w:r>
+    </w:p>
+    <w:p>
+      <w:pPr>
+        <w:pStyle w:val="ListBullet"/>
+      </w:pPr>
+      <w:r>
+        <w:t xml:space="preserve">Une indemnité de </w:t>
+      </w:r>
+      <w:r>
+        <w:rPr>
+          <w:b/>
+        </w:rPr>
+        <w:t>douze pour cent (12 %)</w:t>
+      </w:r>
+      <w:r>
+        <w:t xml:space="preserve"> calculée sur le montant de chaque inscription enregistrée via tout support ou méthode alternative (en ligne, présentiel, autre outil numérique), et ce jusqu'au terme initial de l'engagement de 10 ans.</w:t>
+      </w:r>
+    </w:p>
+    <w:p>
+      <w:r/>
+    </w:p>
+    <w:p>
+      <w:r>
+        <w:t>---</w:t>
+      </w:r>
+    </w:p>
+    <w:p>
+      <w:r/>
+    </w:p>
+    <w:p>
+      <w:pPr>
+        <w:pStyle w:val="Heading2"/>
+        <w:keepNext/>
+        <w:spacing w:before="240" w:after="120"/>
+      </w:pPr>
+      <w:r>
+        <w:rPr>
+          <w:rFonts w:ascii="Calibri Light" w:hAnsi="Calibri Light"/>
+          <w:b/>
+          <w:color w:val="000000"/>
+          <w:sz w:val="32"/>
+        </w:rPr>
+        <w:t>Article 6 — Centralisation Obligatoire des Inscriptions</w:t>
+      </w:r>
+    </w:p>
+    <w:p>
+      <w:r/>
+    </w:p>
+    <w:p>
+      <w:r>
+        <w:t>Tous les candidats, qu'ils optent pour la formule en ligne ou présentiel, doivent obligatoirement s'inscrire via la plateforme OGE Académie. Aucun paiement « hors-système » n'est autorisé. Tout contournement de cette règle est considéré comme une violation du présent contrat.</w:t>
+      </w:r>
+    </w:p>
+    <w:p>
+      <w:r/>
+    </w:p>
+    <w:p>
+      <w:r>
+        <w:t>---</w:t>
+      </w:r>
+    </w:p>
+    <w:p>
+      <w:r/>
+    </w:p>
+    <w:p>
+      <w:pPr>
+        <w:pStyle w:val="Heading2"/>
+        <w:keepNext/>
+        <w:spacing w:before="240" w:after="120"/>
+      </w:pPr>
+      <w:r>
+        <w:rPr>
+          <w:rFonts w:ascii="Calibri Light" w:hAnsi="Calibri Light"/>
+          <w:b/>
+          <w:color w:val="000000"/>
+          <w:sz w:val="32"/>
+        </w:rPr>
+        <w:t>Article 7 — Propriété Intellectuelle</w:t>
+      </w:r>
+    </w:p>
+    <w:p>
+      <w:r/>
+    </w:p>
+    <w:p>
+      <w:pPr>
+        <w:pStyle w:val="ListBullet"/>
+      </w:pPr>
+      <w:r>
+        <w:t xml:space="preserve">Le code source, le design, l'architecture technique et les bases de données de la plateforme restent la </w:t>
+      </w:r>
+      <w:r>
+        <w:rPr>
+          <w:b/>
+        </w:rPr>
+        <w:t>propriété exclusive du Concepteur</w:t>
+      </w:r>
+      <w:r>
+        <w:t>.</w:t>
+      </w:r>
+    </w:p>
+    <w:p>
+      <w:pPr>
+        <w:pStyle w:val="ListBullet"/>
+      </w:pPr>
+      <w:r>
+        <w:t xml:space="preserve">Les supports de cours, les contenus pédagogiques et les données personnelles des élèves restent la </w:t>
+      </w:r>
+      <w:r>
+        <w:rPr>
+          <w:b/>
+        </w:rPr>
+        <w:t>propriété exclusive des Entrepreneurs</w:t>
+      </w:r>
+      <w:r>
+        <w:t>.</w:t>
+      </w:r>
+    </w:p>
+    <w:p>
+      <w:pPr>
+        <w:pStyle w:val="ListBullet"/>
+      </w:pPr>
+      <w:r>
+        <w:t>Les droits d'auteur des professeurs sur leurs supports de cours sont protégés par la plateforme (affichage sécurisé, sans téléchargement ni copie non autorisée).</w:t>
+      </w:r>
+    </w:p>
+    <w:p>
+      <w:r/>
+    </w:p>
+    <w:p>
+      <w:r>
+        <w:t>---</w:t>
+      </w:r>
+    </w:p>
+    <w:p>
+      <w:r/>
+    </w:p>
+    <w:p>
+      <w:pPr>
+        <w:pStyle w:val="Heading2"/>
+        <w:keepNext/>
+        <w:spacing w:before="240" w:after="120"/>
+      </w:pPr>
+      <w:r>
+        <w:rPr>
+          <w:rFonts w:ascii="Calibri Light" w:hAnsi="Calibri Light"/>
+          <w:b/>
+          <w:color w:val="000000"/>
+          <w:sz w:val="32"/>
+        </w:rPr>
+        <w:t>Article 8 — Limitation de Responsabilité du Concepteur</w:t>
+      </w:r>
+    </w:p>
+    <w:p>
+      <w:r/>
+    </w:p>
+    <w:p>
+      <w:r>
+        <w:t xml:space="preserve">En cas d'interruption accidentelle du service ou de perte de données imputable au Concepteur, sa responsabilité financière totale est expressément plafonnée à </w:t>
+      </w:r>
+      <w:r>
+        <w:rPr>
+          <w:b/>
+        </w:rPr>
+        <w:t>un pour cent (1 %)</w:t>
+      </w:r>
+      <w:r>
+        <w:t xml:space="preserve"> des commissions perçues ou dues pour la campagne annuelle en cours. Cette limitation s'applique à tout préjudice direct ou indirect subi par les Entrepreneurs.</w:t>
+      </w:r>
+    </w:p>
+    <w:p>
+      <w:r/>
+    </w:p>
+    <w:p>
+      <w:r>
+        <w:t>---</w:t>
+      </w:r>
+    </w:p>
+    <w:p>
+      <w:r/>
+    </w:p>
+    <w:p>
+      <w:pPr>
+        <w:pStyle w:val="Heading2"/>
+        <w:keepNext/>
+        <w:spacing w:before="240" w:after="120"/>
+      </w:pPr>
+      <w:r>
+        <w:rPr>
+          <w:rFonts w:ascii="Calibri Light" w:hAnsi="Calibri Light"/>
+          <w:b/>
+          <w:color w:val="000000"/>
+          <w:sz w:val="32"/>
+        </w:rPr>
+        <w:t>Article 9 — Confidentialité</w:t>
+      </w:r>
+    </w:p>
+    <w:p>
+      <w:r/>
+    </w:p>
+    <w:p>
+      <w:r>
+        <w:t>Les parties s'engagent à garder strictement confidentielles toutes les informations échangées dans le cadre de ce partenariat (données des candidats, modalités commerciales, architecture technique), et ce pendant toute la durée du contrat et les 3 ans suivant son terme.</w:t>
+      </w:r>
+    </w:p>
+    <w:p>
+      <w:r/>
+    </w:p>
+    <w:p>
+      <w:r>
+        <w:t>---</w:t>
+      </w:r>
+    </w:p>
+    <w:p>
+      <w:r/>
+    </w:p>
+    <w:p>
+      <w:pPr>
+        <w:pStyle w:val="Heading2"/>
+        <w:keepNext/>
+        <w:spacing w:before="240" w:after="120"/>
+      </w:pPr>
+      <w:r>
+        <w:rPr>
+          <w:rFonts w:ascii="Calibri Light" w:hAnsi="Calibri Light"/>
+          <w:b/>
+          <w:color w:val="000000"/>
+          <w:sz w:val="32"/>
+        </w:rPr>
+        <w:t>Article 10 — Droit Applicable &amp; Règlement des Litiges</w:t>
+      </w:r>
+    </w:p>
+    <w:p>
+      <w:r/>
+    </w:p>
+    <w:p>
+      <w:r>
+        <w:t xml:space="preserve">Le présent contrat est soumis au droit ivoirien. En cas de litige, les parties s'engagent à rechercher une solution amiable dans un délai de </w:t>
+      </w:r>
+      <w:r>
+        <w:rPr>
+          <w:b/>
+        </w:rPr>
+        <w:t>trente (30) jours</w:t>
+      </w:r>
+      <w:r>
+        <w:t>. À défaut d'accord, le litige sera soumis au tribunal compétent d'Abidjan.</w:t>
+      </w:r>
+    </w:p>
+    <w:p>
+      <w:r/>
+    </w:p>
+    <w:p>
+      <w:r>
+        <w:t>---</w:t>
+      </w:r>
+    </w:p>
+    <w:p>
+      <w:r/>
+    </w:p>
+    <w:p>
+      <w:r/>
+      <w:r>
+        <w:rPr>
+          <w:b/>
+        </w:rPr>
+        <w:t>SIGNATURES DES PARTIES</w:t>
+      </w:r>
+      <w:r/>
+    </w:p>
+    <w:p>
+      <w:r/>
+    </w:p>
+    <w:p>
+      <w:r>
+        <w:t>Fait à Abidjan / Yamoussoukro, le _____ / _____ / _________</w:t>
+      </w:r>
+    </w:p>
+    <w:p>
+      <w:r/>
+    </w:p>
+    <w:p>
+      <w:r>
+        <w:t>Les parties déclarent avoir lu, compris et accepté l'intégralité des clauses du présent contrat.</w:t>
       </w:r>
     </w:p>
     <w:p>
@@ -88,7 +1415,7 @@
                 <w:b/>
                 <w:color w:val="FFFFFF"/>
               </w:rPr>
-              <w:t>---</w:t>
+              <w:t>LE CONCEPTEUR</w:t>
             </w:r>
           </w:p>
         </w:tc>
@@ -112,1050 +1439,7 @@
                 <w:b/>
                 <w:color w:val="FFFFFF"/>
               </w:rPr>
-              <w:t>---</w:t>
-            </w:r>
-          </w:p>
-        </w:tc>
-      </w:tr>
-      <w:tr>
-        <w:trPr>
-          <w:cantSplit/>
-        </w:trPr>
-        <w:tc>
-          <w:tcPr>
-            <w:tcW w:type="dxa" w:w="4680"/>
-            <w:tcMar>
-              <w:top w:w="140" w:type="dxa"/>
-              <w:bottom w:w="140" w:type="dxa"/>
-              <w:left w:w="180" w:type="dxa"/>
-              <w:right w:w="180" w:type="dxa"/>
-            </w:tcMar>
-          </w:tcPr>
-          <w:p>
-            <w:pPr>
-              <w:jc w:val="left"/>
-            </w:pPr>
-            <w:r/>
-            <w:r>
-              <w:rPr>
-                <w:b/>
-              </w:rPr>
-              <w:t>M. Sidoine K.</w:t>
-            </w:r>
-            <w:r>
-              <w:t xml:space="preserve"> (Concepteur)</w:t>
-            </w:r>
-          </w:p>
-        </w:tc>
-        <w:tc>
-          <w:tcPr>
-            <w:tcW w:type="dxa" w:w="4680"/>
-            <w:tcMar>
-              <w:top w:w="140" w:type="dxa"/>
-              <w:bottom w:w="140" w:type="dxa"/>
-              <w:left w:w="180" w:type="dxa"/>
-              <w:right w:w="180" w:type="dxa"/>
-            </w:tcMar>
-          </w:tcPr>
-          <w:p>
-            <w:pPr>
-              <w:jc w:val="left"/>
-            </w:pPr>
-            <w:r/>
-            <w:r>
-              <w:rPr>
-                <w:b/>
-              </w:rPr>
-              <w:t>OGE Académie</w:t>
-            </w:r>
-            <w:r>
-              <w:t xml:space="preserve"> (M. [Nom de l'Entrepreneur 1] &amp; M. [Nom de l'Entrepreneur 2])</w:t>
-            </w:r>
-          </w:p>
-        </w:tc>
-      </w:tr>
-      <w:tr>
-        <w:trPr>
-          <w:cantSplit/>
-        </w:trPr>
-        <w:tc>
-          <w:tcPr>
-            <w:tcW w:type="dxa" w:w="4680"/>
-            <w:tcMar>
-              <w:top w:w="140" w:type="dxa"/>
-              <w:bottom w:w="140" w:type="dxa"/>
-              <w:left w:w="180" w:type="dxa"/>
-              <w:right w:w="180" w:type="dxa"/>
-            </w:tcMar>
-            <w:shd w:fill="F2F4F4"/>
-          </w:tcPr>
-          <w:p>
-            <w:pPr>
-              <w:jc w:val="left"/>
-            </w:pPr>
-            <w:r>
-              <w:t>krsidoine7@gmail.com</w:t>
-            </w:r>
-          </w:p>
-        </w:tc>
-        <w:tc>
-          <w:tcPr>
-            <w:tcW w:type="dxa" w:w="4680"/>
-            <w:tcMar>
-              <w:top w:w="140" w:type="dxa"/>
-              <w:bottom w:w="140" w:type="dxa"/>
-              <w:left w:w="180" w:type="dxa"/>
-              <w:right w:w="180" w:type="dxa"/>
-            </w:tcMar>
-            <w:shd w:fill="F2F4F4"/>
-          </w:tcPr>
-          <w:p>
-            <w:pPr>
-              <w:jc w:val="left"/>
-            </w:pPr>
-            <w:r>
-              <w:t>Contacts : Administrateurs Généraux</w:t>
-            </w:r>
-          </w:p>
-        </w:tc>
-      </w:tr>
-      <w:tr>
-        <w:trPr>
-          <w:cantSplit/>
-        </w:trPr>
-        <w:tc>
-          <w:tcPr>
-            <w:tcW w:type="dxa" w:w="4680"/>
-            <w:tcMar>
-              <w:top w:w="140" w:type="dxa"/>
-              <w:bottom w:w="140" w:type="dxa"/>
-              <w:left w:w="180" w:type="dxa"/>
-              <w:right w:w="180" w:type="dxa"/>
-            </w:tcMar>
-          </w:tcPr>
-          <w:p>
-            <w:pPr>
-              <w:jc w:val="left"/>
-            </w:pPr>
-            <w:r>
-              <w:t>+225 0503681588</w:t>
-            </w:r>
-          </w:p>
-        </w:tc>
-        <w:tc>
-          <w:tcPr>
-            <w:tcW w:type="dxa" w:w="4680"/>
-            <w:tcMar>
-              <w:top w:w="140" w:type="dxa"/>
-              <w:bottom w:w="140" w:type="dxa"/>
-              <w:left w:w="180" w:type="dxa"/>
-              <w:right w:w="180" w:type="dxa"/>
-            </w:tcMar>
-          </w:tcPr>
-          <w:p>
-            <w:pPr>
-              <w:jc w:val="left"/>
-            </w:pPr>
-            <w:r/>
-            <w:r>
-              <w:rPr>
-                <w:b/>
-              </w:rPr>
-              <w:t>Durée d'engagement :</w:t>
-            </w:r>
-            <w:r>
-              <w:t xml:space="preserve"> 10 Ans Ferme</w:t>
-            </w:r>
-          </w:p>
-        </w:tc>
-      </w:tr>
-    </w:tbl>
-    <w:p>
-      <w:pPr>
-        <w:spacing w:before="120"/>
-      </w:pPr>
-    </w:p>
-    <w:p>
-      <w:r/>
-    </w:p>
-    <w:p>
-      <w:r>
-        <w:t>---</w:t>
-      </w:r>
-    </w:p>
-    <w:p>
-      <w:r/>
-    </w:p>
-    <w:p>
-      <w:pPr>
-        <w:pStyle w:val="Heading2"/>
-        <w:keepNext/>
-        <w:spacing w:before="240" w:after="120"/>
-      </w:pPr>
-      <w:r>
-        <w:rPr>
-          <w:rFonts w:ascii="Calibri Light" w:hAnsi="Calibri Light"/>
-          <w:b/>
-          <w:color w:val="000000"/>
-          <w:sz w:val="32"/>
-        </w:rPr>
-        <w:t>1. Présentation de la Solution OGE Académie</w:t>
-      </w:r>
-    </w:p>
-    <w:p>
-      <w:r/>
-    </w:p>
-    <w:p>
-      <w:r>
-        <w:t>OGE Académie est une solution numérique conçue pour des entrepreneurs proposant des services de préparation aux trois concours d'élite de Côte d'Ivoire : l'INP-HB, l'ESATIC et le CME. Portée par de jeunes diplômés issus de ces écoles qui en maîtrisent parfaitement les concours d’accès, la plateforme a été développée en collaboration avec des professeurs qualifiés pour aider les candidats à réussir.</w:t>
-      </w:r>
-    </w:p>
-    <w:p>
-      <w:r/>
-    </w:p>
-    <w:p>
-      <w:r>
-        <w:t>Cette solution digitale centralisée permet d'assurer :</w:t>
-      </w:r>
-    </w:p>
-    <w:p>
-      <w:pPr>
-        <w:pStyle w:val="ListBullet"/>
-      </w:pPr>
-      <w:r>
-        <w:t>L'inscription simplifiée des candidats en ligne (séparée par zone géographique et mode de préparation présentiel/en ligne).</w:t>
-      </w:r>
-    </w:p>
-    <w:p>
-      <w:pPr>
-        <w:pStyle w:val="ListBullet"/>
-      </w:pPr>
-      <w:r>
-        <w:t>La gestion transparente des offres de préparation et la validation des reçus de paiement locaux (via Wave).</w:t>
-      </w:r>
-    </w:p>
-    <w:p>
-      <w:pPr>
-        <w:pStyle w:val="ListBullet"/>
-      </w:pPr>
-      <w:r>
-        <w:t>La mise à disposition sécurisée des supports de cours PDF et des sessions de visioconférence Google Meet, tout en protégeant les droits d'auteur des professeurs (affichage sécurisé sans téléchargement ni copie non autorisée).</w:t>
-      </w:r>
-    </w:p>
-    <w:p>
-      <w:r/>
-    </w:p>
-    <w:p>
-      <w:r>
-        <w:t>---</w:t>
-      </w:r>
-    </w:p>
-    <w:p>
-      <w:r/>
-    </w:p>
-    <w:p>
-      <w:pPr>
-        <w:pStyle w:val="Heading2"/>
-        <w:keepNext/>
-        <w:spacing w:before="240" w:after="120"/>
-      </w:pPr>
-      <w:r>
-        <w:rPr>
-          <w:rFonts w:ascii="Calibri Light" w:hAnsi="Calibri Light"/>
-          <w:b/>
-          <w:color w:val="000000"/>
-          <w:sz w:val="32"/>
-        </w:rPr>
-        <w:t>2. Stratégie d'Hébergement et Optimisation des Coûts</w:t>
-      </w:r>
-    </w:p>
-    <w:p>
-      <w:r/>
-    </w:p>
-    <w:p>
-      <w:r>
-        <w:t>Afin de démarrer le projet de manière économe, l'architecture a été conçue pour maximiser l'usage des offres gratuites et optimiser le budget technique :</w:t>
-      </w:r>
-    </w:p>
-    <w:p>
-      <w:r/>
-    </w:p>
-    <w:p>
-      <w:pPr>
-        <w:pStyle w:val="ListBullet"/>
-      </w:pPr>
-      <w:r/>
-      <w:r>
-        <w:rPr>
-          <w:b/>
-        </w:rPr>
-        <w:t>Nom de Domaine :</w:t>
-      </w:r>
-      <w:r>
-        <w:t xml:space="preserve"> Acheté et configuré par le Concepteur. Aucun frais de remboursement ou d'acquisition n'est facturé aux Entrepreneurs au démarrage.</w:t>
-      </w:r>
-    </w:p>
-    <w:p>
-      <w:pPr>
-        <w:pStyle w:val="ListBullet"/>
-      </w:pPr>
-      <w:r/>
-      <w:r>
-        <w:rPr>
-          <w:b/>
-        </w:rPr>
-        <w:t>Hébergement applicatif :</w:t>
-      </w:r>
-      <w:r>
-        <w:t xml:space="preserve"> Déployé sur la plateforme Vercel (offre gratuite de démarrage).</w:t>
-      </w:r>
-    </w:p>
-    <w:p>
-      <w:pPr>
-        <w:pStyle w:val="ListBullet"/>
-      </w:pPr>
-      <w:r/>
-      <w:r>
-        <w:rPr>
-          <w:b/>
-        </w:rPr>
-        <w:t>Base de données et Authentification :</w:t>
-      </w:r>
-      <w:r>
-        <w:t xml:space="preserve"> Hébergées sur Supabase (offre gratuite de démarrage).</w:t>
-      </w:r>
-    </w:p>
-    <w:p>
-      <w:pPr>
-        <w:pStyle w:val="ListBullet"/>
-      </w:pPr>
-      <w:r/>
-      <w:r>
-        <w:rPr>
-          <w:b/>
-        </w:rPr>
-        <w:t>Stockage des fichiers (PDFs &amp; Reçus) :</w:t>
-      </w:r>
-      <w:r>
-        <w:t xml:space="preserve"> Stockés sur Supabase. Une migration gratuite vers Cloudflare R2 (10 Go gratuits) sera effectuée par le Concepteur.</w:t>
-      </w:r>
-    </w:p>
-    <w:p>
-      <w:pPr>
-        <w:pStyle w:val="ListBullet"/>
-      </w:pPr>
-      <w:r/>
-      <w:r>
-        <w:rPr>
-          <w:b/>
-        </w:rPr>
-        <w:t>Abonnements de Saison (Juillet - Octobre) :</w:t>
-      </w:r>
-      <w:r>
-        <w:t xml:space="preserve"> Si les quotas gratuits sont dépassés en cours d'année, les abonnements requis (ex : Supabase Pro à 25$/mois) seront à la charge des Entrepreneurs. Pour optimiser les coûts, le Concepteur proposes d'activer ces formules payantes </w:t>
-      </w:r>
-      <w:r>
-        <w:rPr>
-          <w:b/>
-        </w:rPr>
-        <w:t>uniquement durant les 3 mois de préparation active</w:t>
-      </w:r>
-      <w:r>
-        <w:t xml:space="preserve"> (juillet à octobre) et de les suspendre hors saison. Si les Entrepreneurs souhaitent maintenir le service payant actif toute l'année, ils en financeront l'intégralité des mensualités.</w:t>
-      </w:r>
-    </w:p>
-    <w:p>
-      <w:pPr>
-        <w:pStyle w:val="ListBullet"/>
-      </w:pPr>
-      <w:r/>
-      <w:r>
-        <w:rPr>
-          <w:b/>
-        </w:rPr>
-        <w:t>Responsabilité des Frais d'infrastructure :</w:t>
-      </w:r>
-      <w:r>
-        <w:t xml:space="preserve"> Tous les frais d'infrastructure et d'abonnements tiers restent à la charge exclusive des Entrepreneurs. Le Concepteur fournit sa main-d'œuvre de migration et d'intégration à titre gratuit.</w:t>
-      </w:r>
-    </w:p>
-    <w:p>
-      <w:r/>
-    </w:p>
-    <w:p>
-      <w:r>
-        <w:t>---</w:t>
-      </w:r>
-    </w:p>
-    <w:p>
-      <w:r/>
-    </w:p>
-    <w:p>
-      <w:pPr>
-        <w:pStyle w:val="Heading2"/>
-        <w:keepNext/>
-        <w:spacing w:before="240" w:after="120"/>
-      </w:pPr>
-      <w:r>
-        <w:rPr>
-          <w:rFonts w:ascii="Calibri Light" w:hAnsi="Calibri Light"/>
-          <w:b/>
-          <w:color w:val="000000"/>
-          <w:sz w:val="32"/>
-        </w:rPr>
-        <w:t>3. Tarification, Maintenance et Gestion des Données</w:t>
-      </w:r>
-    </w:p>
-    <w:p>
-      <w:r/>
-    </w:p>
-    <w:p>
-      <w:r>
-        <w:t>La tarification repose sur un partage de revenus équitable et l'utilisation autonome de la plateforme :</w:t>
-      </w:r>
-    </w:p>
-    <w:p>
-      <w:r/>
-    </w:p>
-    <w:p>
-      <w:pPr>
-        <w:pStyle w:val="ListBullet"/>
-      </w:pPr>
-      <w:r/>
-      <w:r>
-        <w:rPr>
-          <w:b/>
-        </w:rPr>
-        <w:t>Frais d'Installation initiaux :</w:t>
-      </w:r>
-      <w:r>
-        <w:t xml:space="preserve"> 0 FCFA (Aucun paiement initial. Les Entrepreneurs ne paient rien lors du lancement).</w:t>
-      </w:r>
-    </w:p>
-    <w:p>
-      <w:pPr>
-        <w:pStyle w:val="ListBullet"/>
-      </w:pPr>
-      <w:r/>
-      <w:r>
-        <w:rPr>
-          <w:b/>
-        </w:rPr>
-        <w:t>Commission Récurrente :</w:t>
-      </w:r>
-      <w:r>
-        <w:t xml:space="preserve"> 2 % sur le montant total de chaque transaction d'élève validée sur la plateforme. Règlement unique à la fin de la campagne annuelle de préparation (courant octobre).</w:t>
-      </w:r>
-    </w:p>
-    <w:p>
-      <w:pPr>
-        <w:pStyle w:val="ListBullet"/>
-      </w:pPr>
-      <w:r/>
-      <w:r>
-        <w:rPr>
-          <w:b/>
-        </w:rPr>
-        <w:t>Modification et Gestion des Informations :</w:t>
-      </w:r>
-      <w:r>
-        <w:t xml:space="preserve"> La plateforme intègre un CMS complet permettant de modifier toutes les informations du site (textes de la page d'accueil, coordonnées des centres, tarifs) et de gérer les profils (managers, administrateurs, candidats). </w:t>
-      </w:r>
-      <w:r>
-        <w:rPr>
-          <w:b/>
-        </w:rPr>
-        <w:t>Cette gestion et les mises à jour des données incombent exclusivement aux administrateurs et managers des Entrepreneurs</w:t>
-      </w:r>
-      <w:r>
-        <w:t>. Le Concepteur n'effectue aucune mise à jour d'information. Son rôle est strictement limité à la résolution des problèmes techniques et des bugs système.</w:t>
-      </w:r>
-    </w:p>
-    <w:p>
-      <w:pPr>
-        <w:pStyle w:val="ListBullet"/>
-      </w:pPr>
-      <w:r/>
-      <w:r>
-        <w:rPr>
-          <w:b/>
-        </w:rPr>
-        <w:t>Maintenance Incluse :</w:t>
-      </w:r>
-      <w:r>
-        <w:t xml:space="preserve"> Le Concepteur assure gratuitement la correction des anomalies bloquantes et la mise à jour de l'année scolaire de référence.</w:t>
-      </w:r>
-    </w:p>
-    <w:p>
-      <w:pPr>
-        <w:pStyle w:val="ListBullet"/>
-      </w:pPr>
-      <w:r/>
-      <w:r>
-        <w:rPr>
-          <w:b/>
-        </w:rPr>
-        <w:t>SLA (Support) :</w:t>
-      </w:r>
-      <w:r>
-        <w:t xml:space="preserve"> De juillet à octobre, assistance technique en cas de panne critique sous 4 heures ouvrables (8h00 - 20h00). Demandes nocturnes ou non critiques traitées le lendemain.</w:t>
-      </w:r>
-    </w:p>
-    <w:p>
-      <w:pPr>
-        <w:pStyle w:val="ListBullet"/>
-      </w:pPr>
-      <w:r/>
-      <w:r>
-        <w:rPr>
-          <w:b/>
-        </w:rPr>
-        <w:t>Évolutions majeures :</w:t>
-      </w:r>
-      <w:r>
-        <w:t xml:space="preserve"> Facturées au forfait après devis écrit ou compensées par une hausse de commission mutuellement convenue (ex : passage de 2 % à 2.5 % ou 3 % selon la complexité).</w:t>
-      </w:r>
-    </w:p>
-    <w:p>
-      <w:r/>
-    </w:p>
-    <w:p>
-      <w:r>
-        <w:t>---</w:t>
-      </w:r>
-    </w:p>
-    <w:p>
-      <w:r/>
-    </w:p>
-    <w:p>
-      <w:pPr>
-        <w:pStyle w:val="Heading2"/>
-        <w:keepNext/>
-        <w:spacing w:before="240" w:after="120"/>
-      </w:pPr>
-      <w:r>
-        <w:rPr>
-          <w:rFonts w:ascii="Calibri Light" w:hAnsi="Calibri Light"/>
-          <w:b/>
-          <w:color w:val="000000"/>
-          <w:sz w:val="32"/>
-        </w:rPr>
-        <w:t>4. Clauses Particulières de Protection du Concepteur</w:t>
-      </w:r>
-    </w:p>
-    <w:p>
-      <w:r/>
-    </w:p>
-    <w:p>
-      <w:r>
-        <w:t>Compte tenu de la valeur de la plateforme développée (estimée entre 2 000 000 FCFA et 10 000 000 FCFA) et du temps investi, les clauses suivantes sont intégrées :</w:t>
-      </w:r>
-    </w:p>
-    <w:p>
-      <w:r/>
-    </w:p>
-    <w:p>
-      <w:pPr>
-        <w:pStyle w:val="ListBullet"/>
-      </w:pPr>
-      <w:r/>
-      <w:r>
-        <w:rPr>
-          <w:b/>
-        </w:rPr>
-        <w:t>A. Clause d'Engagement de Dix (10) Ans Obligatoire :</w:t>
-      </w:r>
-      <w:r>
-        <w:t xml:space="preserve"> Les Entrepreneurs s'engagent à utiliser la solution logicielle de manière exclusive pendant 10 ans. Remplacement ou contournement par une autre solution interdits durant cette période.</w:t>
-      </w:r>
-    </w:p>
-    <w:p>
-      <w:pPr>
-        <w:pStyle w:val="ListBullet"/>
-      </w:pPr>
-      <w:r/>
-      <w:r>
-        <w:rPr>
-          <w:b/>
-        </w:rPr>
-        <w:t>B. Clause de Pénalité et Rupture d'Engagement :</w:t>
-      </w:r>
-      <w:r>
-        <w:t xml:space="preserve"> Si les Entrepreneurs résilient le contrat, migrent vers un autre outil (interne ou externe) avant l'échéance de 10 ans, </w:t>
-      </w:r>
-      <w:r>
-        <w:rPr>
-          <w:b/>
-        </w:rPr>
-        <w:t>ou s'ils décident d'arrêter définitivement les cours en ligne ou de ne plus utiliser de plateforme en ligne</w:t>
-      </w:r>
-      <w:r>
-        <w:t>, ils seront redevables au Concepteur de :</w:t>
-      </w:r>
-    </w:p>
-    <w:p>
-      <w:r>
-        <w:t xml:space="preserve">1. Une pénalité forfaitaire et immédiate de </w:t>
-      </w:r>
-      <w:r>
-        <w:rPr>
-          <w:b/>
-        </w:rPr>
-        <w:t>500 000 FCFA</w:t>
-      </w:r>
-      <w:r>
-        <w:t xml:space="preserve"> pour rupture unilatérale.</w:t>
-      </w:r>
-    </w:p>
-    <w:p>
-      <w:r>
-        <w:t xml:space="preserve">2. Une commission réparatrice de </w:t>
-      </w:r>
-      <w:r>
-        <w:rPr>
-          <w:b/>
-        </w:rPr>
-        <w:t>douze pour cent (12 %)</w:t>
-      </w:r>
-      <w:r>
-        <w:t xml:space="preserve"> sur chaque inscription validée via tout autre support ou méthode alternative jusqu'au terme initial des 10 ans.</w:t>
-      </w:r>
-    </w:p>
-    <w:p>
-      <w:pPr>
-        <w:pStyle w:val="ListBullet"/>
-      </w:pPr>
-      <w:r/>
-      <w:r>
-        <w:rPr>
-          <w:b/>
-        </w:rPr>
-        <w:t>C. Centralisation des Inscriptions :</w:t>
-      </w:r>
-      <w:r>
-        <w:t xml:space="preserve"> Tous les candidats (formules En Ligne et Présentiel) doivent obligatoirement s'inscrire via la plateforme. Aucun paiement d'élève 'hors-système' n'est autorisé.</w:t>
-      </w:r>
-    </w:p>
-    <w:p>
-      <w:pPr>
-        <w:pStyle w:val="ListBullet"/>
-      </w:pPr>
-      <w:r/>
-      <w:r>
-        <w:rPr>
-          <w:b/>
-        </w:rPr>
-        <w:t>D. Limitation de Responsabilité Financière :</w:t>
-      </w:r>
-      <w:r>
-        <w:t xml:space="preserve"> En cas d'interruption accidentelle ou perte de données, la responsabilité financière cumulée du Concepteur est expressément plafonnée au montant de </w:t>
-      </w:r>
-      <w:r>
-        <w:rPr>
-          <w:b/>
-        </w:rPr>
-        <w:t>1 %</w:t>
-      </w:r>
-      <w:r>
-        <w:t xml:space="preserve"> des commissions perçues ou dues pour la campagne annuelle en cours.</w:t>
-      </w:r>
-    </w:p>
-    <w:p>
-      <w:r/>
-    </w:p>
-    <w:p>
-      <w:r>
-        <w:t>---</w:t>
-      </w:r>
-    </w:p>
-    <w:p>
-      <w:r/>
-    </w:p>
-    <w:p>
-      <w:pPr>
-        <w:pStyle w:val="Heading2"/>
-        <w:keepNext/>
-        <w:spacing w:before="240" w:after="120"/>
-      </w:pPr>
-      <w:r>
-        <w:rPr>
-          <w:rFonts w:ascii="Calibri Light" w:hAnsi="Calibri Light"/>
-          <w:b/>
-          <w:color w:val="000000"/>
-          <w:sz w:val="32"/>
-        </w:rPr>
-        <w:t>5. Contrat de Partenariat Juridique</w:t>
-      </w:r>
-    </w:p>
-    <w:p>
-      <w:r/>
-    </w:p>
-    <w:p>
-      <w:pPr>
-        <w:pStyle w:val="Heading3"/>
-        <w:keepNext/>
-        <w:spacing w:before="240" w:after="120"/>
-      </w:pPr>
-      <w:r>
-        <w:rPr>
-          <w:rFonts w:ascii="Calibri Light" w:hAnsi="Calibri Light"/>
-          <w:b/>
-          <w:color w:val="000000"/>
-          <w:sz w:val="26"/>
-        </w:rPr>
-        <w:t>ENTRE LES SOUSSIGNÉS :</w:t>
-      </w:r>
-    </w:p>
-    <w:p>
-      <w:r>
-        <w:t>M. Sidoine K. (krsidoine7@gmail.com | +225 0503681588), ci-après désigné « Le Concepteur ».</w:t>
-      </w:r>
-    </w:p>
-    <w:p>
-      <w:r/>
-    </w:p>
-    <w:p>
-      <w:r>
-        <w:t>Et l'entité OGE Académie, représentée conjointement par ses deux entrepreneurs co-fondateurs : M. [Nom de l'Entrepreneur 1] et M. [Nom de l'Entrepreneur 2], ci-après désignés « Les Entrepreneurs ».</w:t>
-      </w:r>
-    </w:p>
-    <w:p>
-      <w:r/>
-    </w:p>
-    <w:p>
-      <w:pPr>
-        <w:pStyle w:val="Heading3"/>
-        <w:keepNext/>
-        <w:spacing w:before="240" w:after="120"/>
-      </w:pPr>
-      <w:r>
-        <w:rPr>
-          <w:rFonts w:ascii="Calibri Light" w:hAnsi="Calibri Light"/>
-          <w:b/>
-          <w:color w:val="000000"/>
-          <w:sz w:val="26"/>
-        </w:rPr>
-        <w:t>IL A ÉTÉ CONVENU CE QUI SUIT :</w:t>
-      </w:r>
-    </w:p>
-    <w:p>
-      <w:r/>
-    </w:p>
-    <w:p>
-      <w:r/>
-      <w:r>
-        <w:rPr>
-          <w:b/>
-        </w:rPr>
-        <w:t>Article 1 : Objet du contrat</w:t>
-      </w:r>
-      <w:r/>
-    </w:p>
-    <w:p>
-      <w:r>
-        <w:t>Le présent contrat a pour objet la mise à disposition exclusive et l'intégration de la plateforme web OGE Académie par le Concepteur au profit des Entrepreneurs pour la gestion en ligne et en présentiel (avec l'appui d'enseignants) de ses préparations aux concours.</w:t>
-      </w:r>
-    </w:p>
-    <w:p>
-      <w:r/>
-    </w:p>
-    <w:p>
-      <w:r/>
-      <w:r>
-        <w:rPr>
-          <w:b/>
-        </w:rPr>
-        <w:t>Article 2 : Conditions Financières &amp; Hébergement</w:t>
-      </w:r>
-      <w:r/>
-    </w:p>
-    <w:p>
-      <w:pPr>
-        <w:pStyle w:val="ListBullet"/>
-      </w:pPr>
-      <w:r/>
-      <w:r>
-        <w:rPr>
-          <w:b/>
-        </w:rPr>
-        <w:t>Frais initiaux :</w:t>
-      </w:r>
-      <w:r>
-        <w:t xml:space="preserve"> Aucun frais d'installation ni de mise en route (0 FCFA).</w:t>
-      </w:r>
-    </w:p>
-    <w:p>
-      <w:pPr>
-        <w:pStyle w:val="ListBullet"/>
-      </w:pPr>
-      <w:r/>
-      <w:r>
-        <w:rPr>
-          <w:b/>
-        </w:rPr>
-        <w:t>Redevance :</w:t>
-      </w:r>
-      <w:r>
-        <w:t xml:space="preserve"> Les Entrepreneurs verseront 2% sur chaque paiement d'élève validé (En Ligne et Présentiel). Versement unique en fin de campagne (courant octobre).</w:t>
-      </w:r>
-    </w:p>
-    <w:p>
-      <w:pPr>
-        <w:pStyle w:val="ListBullet"/>
-      </w:pPr>
-      <w:r/>
-      <w:r>
-        <w:rPr>
-          <w:b/>
-        </w:rPr>
-        <w:t>Hébergement :</w:t>
-      </w:r>
-      <w:r>
-        <w:t xml:space="preserve"> En cas de dépassement des quotas, les Entrepreneurs financent les abonnements. Pour optimiser les coûts, le Concepteur propose d'activer ces formules payantes uniquement durant la saison active de juillet à octobre (3 mois).</w:t>
-      </w:r>
-    </w:p>
-    <w:p>
-      <w:r/>
-    </w:p>
-    <w:p>
-      <w:r/>
-      <w:r>
-        <w:rPr>
-          <w:b/>
-        </w:rPr>
-        <w:t>Article 3 : Maintenance, Évolutions et CMS</w:t>
-      </w:r>
-      <w:r/>
-    </w:p>
-    <w:p>
-      <w:pPr>
-        <w:pStyle w:val="ListBullet"/>
-      </w:pPr>
-      <w:r>
-        <w:t>Les corrections de bugs sont incluses. Les nouvelles fonctionnalités feront l'objet d'un forfait ou d'une revalorisation de la commission.</w:t>
-      </w:r>
-    </w:p>
-    <w:p>
-      <w:pPr>
-        <w:pStyle w:val="ListBullet"/>
-      </w:pPr>
-      <w:r>
-        <w:t>La gestion, modification et mise à jour de toutes les informations stockées (données des candidats, managers, admins et textes de la page d'accueil) sont de la responsabilité exclusive des Entrepreneurs via leur dashboard CMS. Le Concepteur n'intervient que pour les dysfonctionnements techniques.</w:t>
-      </w:r>
-    </w:p>
-    <w:p>
-      <w:r/>
-    </w:p>
-    <w:p>
-      <w:r/>
-      <w:r>
-        <w:rPr>
-          <w:b/>
-        </w:rPr>
-        <w:t>Article 4 : Durée d'Engagement &amp; Exclusivité (10 Ans)</w:t>
-      </w:r>
-      <w:r/>
-    </w:p>
-    <w:p>
-      <w:r>
-        <w:t>Le contrat est conclu pour une durée ferme de dix (10) ans. Les Entrepreneurs s'engagent à utiliser exclusivement la solution du Concepteur durant cette période.</w:t>
-      </w:r>
-    </w:p>
-    <w:p>
-      <w:r/>
-    </w:p>
-    <w:p>
-      <w:r/>
-      <w:r>
-        <w:rPr>
-          <w:b/>
-        </w:rPr>
-        <w:t>Article 5 : Résiliation, Arrêt de Service &amp; Pénalités</w:t>
-      </w:r>
-      <w:r/>
-    </w:p>
-    <w:p>
-      <w:r>
-        <w:t>En cas de rupture anticipée du contrat, d'utilisation d'une plateforme concurrente avant le terme de 10 ans, ou en cas de décision des Entrepreneurs d'arrêter définitivement l'usage de plateformes en ligne ou de cours en ligne, ces derniers s'engagent solidairement à verser au Concepteur :</w:t>
-      </w:r>
-    </w:p>
-    <w:p>
-      <w:r>
-        <w:t xml:space="preserve">1. Une pénalité fixe de rupture de </w:t>
-      </w:r>
-      <w:r>
-        <w:rPr>
-          <w:b/>
-        </w:rPr>
-        <w:t>500 000 FCFA</w:t>
-      </w:r>
-      <w:r>
-        <w:t>.</w:t>
-      </w:r>
-    </w:p>
-    <w:p>
-      <w:r>
-        <w:t xml:space="preserve">2. Une indemnité mensuelle de </w:t>
-      </w:r>
-      <w:r>
-        <w:rPr>
-          <w:b/>
-        </w:rPr>
-        <w:t>12 %</w:t>
-      </w:r>
-      <w:r>
-        <w:t xml:space="preserve"> du montant de chaque inscription enregistrée via toute méthode alternative jusqu'au terme de l'engagement de 10 ans.</w:t>
-      </w:r>
-    </w:p>
-    <w:p>
-      <w:r/>
-    </w:p>
-    <w:p>
-      <w:r/>
-      <w:r>
-        <w:rPr>
-          <w:b/>
-        </w:rPr>
-        <w:t>Article 6 : Propriété Intellectuelle</w:t>
-      </w:r>
-      <w:r/>
-    </w:p>
-    <w:p>
-      <w:r>
-        <w:t>Le code source, le design et les bases de données restent la propriété du Concepteur. Les supports de cours et les données des élèves restent la propriété des Entrepreneurs.</w:t>
-      </w:r>
-    </w:p>
-    <w:p>
-      <w:r/>
-    </w:p>
-    <w:p>
-      <w:r/>
-      <w:r>
-        <w:rPr>
-          <w:b/>
-        </w:rPr>
-        <w:t>Article 7 : SLA &amp; Limitation de Responsabilité</w:t>
-      </w:r>
-      <w:r/>
-    </w:p>
-    <w:p>
-      <w:pPr>
-        <w:pStyle w:val="ListBullet"/>
-      </w:pPr>
-      <w:r/>
-      <w:r>
-        <w:rPr>
-          <w:b/>
-        </w:rPr>
-        <w:t>SLA :</w:t>
-      </w:r>
-      <w:r>
-        <w:t xml:space="preserve"> Assistance technique en cas de panne critique sous 4 heures ouvrables (8h - 20h) de juillet à octobre.</w:t>
-      </w:r>
-    </w:p>
-    <w:p>
-      <w:pPr>
-        <w:pStyle w:val="ListBullet"/>
-      </w:pPr>
-      <w:r/>
-      <w:r>
-        <w:rPr>
-          <w:b/>
-        </w:rPr>
-        <w:t>Plafond de Responsabilité :</w:t>
-      </w:r>
-      <w:r>
-        <w:t xml:space="preserve"> La responsabilité totale du Concepteur est expressément plafonnée à </w:t>
-      </w:r>
-      <w:r>
-        <w:rPr>
-          <w:b/>
-        </w:rPr>
-        <w:t>1 %</w:t>
-      </w:r>
-      <w:r>
-        <w:t xml:space="preserve"> des commissions perçues en exécution du présent contrat sur la campagne annuelle concernée.</w:t>
-      </w:r>
-    </w:p>
-    <w:p>
-      <w:r/>
-    </w:p>
-    <w:p>
-      <w:r>
-        <w:t>---</w:t>
-      </w:r>
-    </w:p>
-    <w:p>
-      <w:r/>
-    </w:p>
-    <w:p>
-      <w:r>
-        <w:t>Fait à [Ville], le [Date]</w:t>
-      </w:r>
-    </w:p>
-    <w:p>
-      <w:r/>
-    </w:p>
-    <w:tbl>
-      <w:tblPr>
-        <w:tblStyle w:val="TableGrid"/>
-        <w:tblW w:type="auto" w:w="0"/>
-        <w:tblLook w:firstColumn="1" w:firstRow="1" w:lastColumn="0" w:lastRow="0" w:noHBand="0" w:noVBand="1" w:val="04A0"/>
-      </w:tblPr>
-      <w:tblGrid>
-        <w:gridCol w:w="4680"/>
-        <w:gridCol w:w="4680"/>
-      </w:tblGrid>
-      <w:tr>
-        <w:trPr>
-          <w:cantSplit/>
-          <w:tblHeader/>
-        </w:trPr>
-        <w:tc>
-          <w:tcPr>
-            <w:tcW w:type="dxa" w:w="4680"/>
-            <w:tcMar>
-              <w:top w:w="140" w:type="dxa"/>
-              <w:bottom w:w="140" w:type="dxa"/>
-              <w:left w:w="180" w:type="dxa"/>
-              <w:right w:w="180" w:type="dxa"/>
-            </w:tcMar>
-            <w:shd w:fill="FF7900"/>
-          </w:tcPr>
-          <w:p>
-            <w:pPr>
-              <w:jc w:val="center"/>
-            </w:pPr>
-            <w:r>
-              <w:rPr>
-                <w:b/>
-                <w:color w:val="FFFFFF"/>
-              </w:rPr>
-              <w:t>Pour Le Concepteur</w:t>
-            </w:r>
-          </w:p>
-        </w:tc>
-        <w:tc>
-          <w:tcPr>
-            <w:tcW w:type="dxa" w:w="4680"/>
-            <w:tcMar>
-              <w:top w:w="140" w:type="dxa"/>
-              <w:bottom w:w="140" w:type="dxa"/>
-              <w:left w:w="180" w:type="dxa"/>
-              <w:right w:w="180" w:type="dxa"/>
-            </w:tcMar>
-            <w:shd w:fill="FF7900"/>
-          </w:tcPr>
-          <w:p>
-            <w:pPr>
-              <w:jc w:val="center"/>
-            </w:pPr>
-            <w:r>
-              <w:rPr>
-                <w:b/>
-                <w:color w:val="FFFFFF"/>
-              </w:rPr>
-              <w:t>Pour Les Entrepreneurs d'OGE Académie</w:t>
+              <w:t>LES ENTREPRENEURS — OGE ACADÉMIE</w:t>
             </w:r>
           </w:p>
         </w:tc>
@@ -1243,7 +1527,7 @@
               <w:jc w:val="left"/>
             </w:pPr>
             <w:r>
-              <w:t>M. / Mme [Nom de l'Entrepreneur 1]</w:t>
+              <w:t>M. / Mme ___________________________</w:t>
             </w:r>
           </w:p>
         </w:tc>
@@ -1267,7 +1551,7 @@
               <w:jc w:val="left"/>
             </w:pPr>
             <w:r>
-              <w:t>(Signature et mention "Lu et approuvé")</w:t>
+              <w:t>krsidoine7@gmail.com</w:t>
             </w:r>
           </w:p>
         </w:tc>
@@ -1286,7 +1570,7 @@
               <w:jc w:val="left"/>
             </w:pPr>
             <w:r>
-              <w:t>(Signature et mention "Lu et approuvé")</w:t>
+              <w:t>M. / Mme ___________________________</w:t>
             </w:r>
           </w:p>
         </w:tc>
@@ -1310,7 +1594,9 @@
             <w:pPr>
               <w:jc w:val="left"/>
             </w:pPr>
-            <w:r/>
+            <w:r>
+              <w:t>+225 05 03 68 15 88</w:t>
+            </w:r>
           </w:p>
         </w:tc>
         <w:tc>
@@ -1328,9 +1614,7 @@
             <w:pPr>
               <w:jc w:val="left"/>
             </w:pPr>
-            <w:r>
-              <w:t>M. / Mme [Nom de l'Entrepreneur 2]</w:t>
-            </w:r>
+            <w:r/>
           </w:p>
         </w:tc>
       </w:tr>
@@ -1352,7 +1636,9 @@
             <w:pPr>
               <w:jc w:val="left"/>
             </w:pPr>
-            <w:r/>
+            <w:r>
+              <w:t>Signature &amp; mention « Lu et approuvé » :</w:t>
+            </w:r>
           </w:p>
         </w:tc>
         <w:tc>
@@ -1370,7 +1656,52 @@
               <w:jc w:val="left"/>
             </w:pPr>
             <w:r>
-              <w:t>(Signature et mention "Lu et approuvé")</w:t>
+              <w:t>Signature &amp; mention « Lu et approuvé » :</w:t>
+            </w:r>
+          </w:p>
+        </w:tc>
+      </w:tr>
+      <w:tr>
+        <w:trPr>
+          <w:cantSplit/>
+        </w:trPr>
+        <w:tc>
+          <w:tcPr>
+            <w:tcW w:type="dxa" w:w="4680"/>
+            <w:tcMar>
+              <w:top w:w="140" w:type="dxa"/>
+              <w:bottom w:w="140" w:type="dxa"/>
+              <w:left w:w="180" w:type="dxa"/>
+              <w:right w:w="180" w:type="dxa"/>
+            </w:tcMar>
+            <w:shd w:fill="F2F4F4"/>
+          </w:tcPr>
+          <w:p>
+            <w:pPr>
+              <w:jc w:val="left"/>
+            </w:pPr>
+            <w:r>
+              <w:t>Date : _____ / _____ / _________</w:t>
+            </w:r>
+          </w:p>
+        </w:tc>
+        <w:tc>
+          <w:tcPr>
+            <w:tcW w:type="dxa" w:w="4680"/>
+            <w:tcMar>
+              <w:top w:w="140" w:type="dxa"/>
+              <w:bottom w:w="140" w:type="dxa"/>
+              <w:left w:w="180" w:type="dxa"/>
+              <w:right w:w="180" w:type="dxa"/>
+            </w:tcMar>
+            <w:shd w:fill="F2F4F4"/>
+          </w:tcPr>
+          <w:p>
+            <w:pPr>
+              <w:jc w:val="left"/>
+            </w:pPr>
+            <w:r>
+              <w:t>Date : _____ / _____ / _________</w:t>
             </w:r>
           </w:p>
         </w:tc>
@@ -1380,6 +1711,22 @@
       <w:pPr>
         <w:spacing w:before="120"/>
       </w:pPr>
+    </w:p>
+    <w:p>
+      <w:r/>
+    </w:p>
+    <w:p>
+      <w:r>
+        <w:t>---</w:t>
+      </w:r>
+    </w:p>
+    <w:p>
+      <w:r/>
+    </w:p>
+    <w:p>
+      <w:r>
+        <w:t>— Document confidentiel — OGE Académie © 2025 —</w:t>
+      </w:r>
     </w:p>
     <w:sectPr>
       <w:pgSz w:w="12240" w:h="15840"/>

</xml_diff>